<commit_message>
docs: Conformal 애매구간, RISK-08~12, RACI, 사례, 흐름도 갱신
</commit_message>
<xml_diff>
--- a/docs/BaseKit1-2_완성본.docx
+++ b/docs/BaseKit1-2_완성본.docx
@@ -363,6 +363,30 @@
     </w:p>
     <w:p>
       <w:pPr>
+        <w:spacing w:after="120"/>
+      </w:pPr>
+      <w:r>
+        <w:rPr>
+          <w:rFonts w:ascii="맑은 고딕" w:cs="맑은 고딕" w:eastAsia="맑은 고딕" w:hAnsi="맑은 고딕"/>
+          <w:b/>
+          <w:bCs/>
+        </w:rPr>
+        <w:t xml:space="preserve">대표 사례 (실제 보도 비교, 기관·언론사명 비공개)</w:t>
+      </w:r>
+    </w:p>
+    <w:p>
+      <w:pPr>
+        <w:spacing w:after="120"/>
+      </w:pPr>
+      <w:r>
+        <w:rPr>
+          <w:rFonts w:ascii="맑은 고딕" w:cs="맑은 고딕" w:eastAsia="맑은 고딕" w:hAnsi="맑은 고딕"/>
+        </w:rPr>
+        <w:t xml:space="preserve">대학 비대면 시험의 부정행위 의혹을 다룬 동일 사건 보도 3건을 비교했을 때, 세 제목 모두 학생 커뮤니티 익명 투표의 “커닝했다” 응답 수(수백 명대)를 확정된 부정행위자 수처럼 제시하거나 AI 사용을 사실로 단정했다. 그러나 본문은 “실제 인원은 확인되지 않았다”, “AI 사용은 학생 증언에 근거한 추정”이라고 밝히고 있었다. 독자가 제목만 읽으면 본문이 말하는 것보다 훨씬 강한 사실로 받아들이게 되며, 이것이 본 서비스가 줄이려는 문제의 구체적 모습이다. (본 서비스는 이러한 제목-본문 일치성만 판단하며, 본문 사실 여부는 1-3-1에 따라 판단하지 않는다.)</w:t>
+      </w:r>
+    </w:p>
+    <w:p>
+      <w:pPr>
         <w:pStyle w:val="Heading2"/>
         <w:spacing w:after="120" w:before="240"/>
       </w:pPr>
@@ -806,7 +830,7 @@
                 <w:sz w:val="19"/>
                 <w:szCs w:val="19"/>
               </w:rPr>
-              <w:t xml:space="preserve">자율조치(위험도 낮음→자동통과) / 사전승인 필요(클릭베이트 판정) / 자동판정 중지(정치 민감 주제·신뢰도 낮음)</w:t>
+              <w:t xml:space="preserve">자율조치(위험도 낮음→자동통과) / 사전승인 필요(클릭베이트 판정) / 자동판정 중지(정치 민감 주제·예측집합 애매)</w:t>
             </w:r>
           </w:p>
         </w:tc>
@@ -1058,7 +1082,7 @@
                 <w:sz w:val="19"/>
                 <w:szCs w:val="19"/>
               </w:rPr>
-              <w:t xml:space="preserve">기사 내용의 사실관계·출처 신뢰도 확인</w:t>
+              <w:t xml:space="preserve">기사 내용의 사실관계·출처 신뢰도 확인. 외부 출처를 검색(RAG)해 사실 확인을 지원(최종 판단은 사람)</w:t>
             </w:r>
           </w:p>
         </w:tc>
@@ -1081,7 +1105,7 @@
                 <w:sz w:val="19"/>
                 <w:szCs w:val="19"/>
               </w:rPr>
-              <w:t xml:space="preserve">제목+본문</w:t>
+              <w:t xml:space="preserve">제목+본문, 검색된 외부 출처</w:t>
             </w:r>
           </w:p>
         </w:tc>
@@ -1104,7 +1128,7 @@
                 <w:sz w:val="19"/>
                 <w:szCs w:val="19"/>
               </w:rPr>
-              <w:t xml:space="preserve">사실성 점수, 출처 신뢰도</w:t>
+              <w:t xml:space="preserve">근거 출처 링크를 포함한 사실성 판단 보조 정보</w:t>
             </w:r>
           </w:p>
         </w:tc>
@@ -1480,7 +1504,7 @@
                 <w:sz w:val="19"/>
                 <w:szCs w:val="19"/>
               </w:rPr>
-              <w:t xml:space="preserve">본문이 틀렸더라도 제목과 일치하면 ①은 통과시킬 수 있음 → RISK-07로 기록, 사실 확인이 필요한 건은 검토자의 외부 출처 확인 또는 ② 검증 Agent 확장으로 연결</w:t>
+              <w:t xml:space="preserve">본문이 틀렸더라도 제목과 일치하면 ①은 통과시킬 수 있음 → RISK-07로 기록, 사실 확인이 필요한 건은 검토자의 외부 출처 확인 또는 ② 검증 Agent(외부 출처 검색 RAG) 확장으로 연결</w:t>
             </w:r>
           </w:p>
         </w:tc>
@@ -2017,6 +2041,38 @@
         <w:rPr>
           <w:rFonts w:ascii="맑은 고딕" w:cs="맑은 고딕" w:eastAsia="맑은 고딕" w:hAnsi="맑은 고딕"/>
         </w:rPr>
+        <w:t xml:space="preserve">제목이 “설문 응답 수”나 “추정”을 확정 수치·사실처럼 표기 → 제목-본문 일치성 불일치로 탐지 대상</w:t>
+      </w:r>
+    </w:p>
+    <w:p>
+      <w:pPr>
+        <w:pStyle w:val="ListParagraph"/>
+        <w:numPr>
+          <w:ilvl w:val="0"/>
+          <w:numId w:val="1"/>
+        </w:numPr>
+        <w:spacing w:after="60"/>
+      </w:pPr>
+      <w:r>
+        <w:rPr>
+          <w:rFonts w:ascii="맑은 고딕" w:cs="맑은 고딕" w:eastAsia="맑은 고딕" w:hAnsi="맑은 고딕"/>
+        </w:rPr>
+        <w:t xml:space="preserve">기사 본문에 모델을 향한 지시문 포함(프롬프트 인젝션) → 입력 격리 후 판단, 이상 징후 시 사람에게 이관</w:t>
+      </w:r>
+    </w:p>
+    <w:p>
+      <w:pPr>
+        <w:pStyle w:val="ListParagraph"/>
+        <w:numPr>
+          <w:ilvl w:val="0"/>
+          <w:numId w:val="1"/>
+        </w:numPr>
+        <w:spacing w:after="60"/>
+      </w:pPr>
+      <w:r>
+        <w:rPr>
+          <w:rFonts w:ascii="맑은 고딕" w:cs="맑은 고딕" w:eastAsia="맑은 고딕" w:hAnsi="맑은 고딕"/>
+        </w:rPr>
         <w:t xml:space="preserve">검토 대기열 초과 / 검토자 부재 상태에서 판단 요청 발생</w:t>
       </w:r>
     </w:p>
@@ -4077,7 +4133,7 @@
         <w:rPr>
           <w:rFonts w:ascii="맑은 고딕" w:cs="맑은 고딕" w:eastAsia="맑은 고딕" w:hAnsi="맑은 고딕"/>
         </w:rPr>
-        <w:t xml:space="preserve">팀의 선택: 클릭베이트를 놓치는 피해가 더 크다고 보아 재현율을 우선하고, 그 대가로 늘어나는 오탐·과잉 차단은 판단 신뢰도가 애매한 구간(0.4~0.6, 초기값)을 전부 사람에게 이관해 제어한다. 즉 “AI가 애매하면 틀리지 않고 사람에게 넘긴다”를 원칙으로 책임 소재를 명확히 한다. 이 기준값을 정하는 주체는 AI기획자이며, 신뢰도 보정 결과와 운영 데이터가 쌓이면 팀 논의로 재조정한다.</w:t>
+        <w:t xml:space="preserve">팀의 선택: 클릭베이트를 놓치는 피해가 더 크다고 보아 재현율을 우선하고, 그 대가로 늘어나는 오탐·과잉 차단은 판단이 애매한 경우(conformal 예측집합이 {클릭베이트, 정상}을 모두 포함하거나 공집합인 경우)를 전부 사람에게 이관해 제어한다. 임의의 숫자 구간을 쓰지 않고 데이터에서 도출하며, “AI가 애매하면 틀리지 않고 사람에게 넘긴다”를 원칙으로 책임 소재를 명확히 한다. 허용 오류 α를 정하는 주체는 AI기획자이며, 운영 데이터가 쌓이면 팀 논의로 재조정한다.</w:t>
       </w:r>
     </w:p>
     <w:p>
@@ -4456,7 +4512,7 @@
         <w:rPr>
           <w:rFonts w:ascii="맑은 고딕" w:cs="맑은 고딕" w:eastAsia="맑은 고딕" w:hAnsi="맑은 고딕"/>
         </w:rPr>
-        <w:t xml:space="preserve">BK01의 영향(IMPACT-01~04)과 서비스 범위의 한계를 위험(RISK-01~07)으로 전환.</w:t>
+        <w:t xml:space="preserve">BK01의 영향(IMPACT-01~04), 서비스 범위의 한계, 에이전트·데이터 특성을 위험(RISK-01~12)으로 전환.</w:t>
       </w:r>
     </w:p>
     <w:tbl>
@@ -4836,7 +4892,7 @@
                 <w:sz w:val="19"/>
                 <w:szCs w:val="19"/>
               </w:rPr>
-              <w:t xml:space="preserve">경감: 신뢰도 낮으면 사람에게 이관</w:t>
+              <w:t xml:space="preserve">경감: 애매하면(conformal 예측집합) 사람에게 이관</w:t>
             </w:r>
           </w:p>
         </w:tc>
@@ -5976,6 +6032,936 @@
                 <w:szCs w:val="19"/>
               </w:rPr>
               <w:t xml:space="preserve">AI기획자</w:t>
+            </w:r>
+          </w:p>
+        </w:tc>
+      </w:tr>
+      <w:tr>
+        <w:tc>
+          <w:tcPr>
+            <w:tcW w:type="dxa" w:w="900"/>
+            <w:tcMar>
+              <w:top w:type="dxa" w:w="60"/>
+              <w:left w:type="dxa" w:w="100"/>
+              <w:bottom w:type="dxa" w:w="60"/>
+              <w:right w:type="dxa" w:w="100"/>
+            </w:tcMar>
+          </w:tcPr>
+          <w:p>
+            <w:r>
+              <w:rPr>
+                <w:rFonts w:ascii="맑은 고딕" w:cs="맑은 고딕" w:eastAsia="맑은 고딕" w:hAnsi="맑은 고딕"/>
+                <w:b w:val="false"/>
+                <w:bCs w:val="false"/>
+                <w:sz w:val="19"/>
+                <w:szCs w:val="19"/>
+              </w:rPr>
+              <w:t xml:space="preserve">RISK-08</w:t>
+            </w:r>
+          </w:p>
+        </w:tc>
+        <w:tc>
+          <w:tcPr>
+            <w:tcW w:type="dxa" w:w="2300"/>
+            <w:tcMar>
+              <w:top w:type="dxa" w:w="60"/>
+              <w:left w:type="dxa" w:w="100"/>
+              <w:bottom w:type="dxa" w:w="60"/>
+              <w:right w:type="dxa" w:w="100"/>
+            </w:tcMar>
+          </w:tcPr>
+          <w:p>
+            <w:r>
+              <w:rPr>
+                <w:rFonts w:ascii="맑은 고딕" w:cs="맑은 고딕" w:eastAsia="맑은 고딕" w:hAnsi="맑은 고딕"/>
+                <w:b w:val="false"/>
+                <w:bCs w:val="false"/>
+                <w:sz w:val="19"/>
+                <w:szCs w:val="19"/>
+              </w:rPr>
+              <w:t xml:space="preserve">본문에 숨겨진 지시문(프롬프트 인젝션)으로 모델 판단 조작</w:t>
+            </w:r>
+          </w:p>
+        </w:tc>
+        <w:tc>
+          <w:tcPr>
+            <w:tcW w:type="dxa" w:w="1000"/>
+            <w:tcMar>
+              <w:top w:type="dxa" w:w="60"/>
+              <w:left w:type="dxa" w:w="100"/>
+              <w:bottom w:type="dxa" w:w="60"/>
+              <w:right w:type="dxa" w:w="100"/>
+            </w:tcMar>
+          </w:tcPr>
+          <w:p>
+            <w:r>
+              <w:rPr>
+                <w:rFonts w:ascii="맑은 고딕" w:cs="맑은 고딕" w:eastAsia="맑은 고딕" w:hAnsi="맑은 고딕"/>
+                <w:b w:val="false"/>
+                <w:bCs w:val="false"/>
+                <w:sz w:val="19"/>
+                <w:szCs w:val="19"/>
+              </w:rPr>
+              <w:t xml:space="preserve">IMPACT-01,02</w:t>
+            </w:r>
+          </w:p>
+        </w:tc>
+        <w:tc>
+          <w:tcPr>
+            <w:tcW w:type="dxa" w:w="600"/>
+            <w:tcMar>
+              <w:top w:type="dxa" w:w="60"/>
+              <w:left w:type="dxa" w:w="100"/>
+              <w:bottom w:type="dxa" w:w="60"/>
+              <w:right w:type="dxa" w:w="100"/>
+            </w:tcMar>
+          </w:tcPr>
+          <w:p>
+            <w:r>
+              <w:rPr>
+                <w:rFonts w:ascii="맑은 고딕" w:cs="맑은 고딕" w:eastAsia="맑은 고딕" w:hAnsi="맑은 고딕"/>
+                <w:b w:val="false"/>
+                <w:bCs w:val="false"/>
+                <w:sz w:val="19"/>
+                <w:szCs w:val="19"/>
+              </w:rPr>
+              <w:t xml:space="preserve">2</w:t>
+            </w:r>
+          </w:p>
+        </w:tc>
+        <w:tc>
+          <w:tcPr>
+            <w:tcW w:type="dxa" w:w="600"/>
+            <w:tcMar>
+              <w:top w:type="dxa" w:w="60"/>
+              <w:left w:type="dxa" w:w="100"/>
+              <w:bottom w:type="dxa" w:w="60"/>
+              <w:right w:type="dxa" w:w="100"/>
+            </w:tcMar>
+          </w:tcPr>
+          <w:p>
+            <w:r>
+              <w:rPr>
+                <w:rFonts w:ascii="맑은 고딕" w:cs="맑은 고딕" w:eastAsia="맑은 고딕" w:hAnsi="맑은 고딕"/>
+                <w:b w:val="false"/>
+                <w:bCs w:val="false"/>
+                <w:sz w:val="19"/>
+                <w:szCs w:val="19"/>
+              </w:rPr>
+              <w:t xml:space="preserve">3</w:t>
+            </w:r>
+          </w:p>
+        </w:tc>
+        <w:tc>
+          <w:tcPr>
+            <w:tcW w:type="dxa" w:w="600"/>
+            <w:tcMar>
+              <w:top w:type="dxa" w:w="60"/>
+              <w:left w:type="dxa" w:w="100"/>
+              <w:bottom w:type="dxa" w:w="60"/>
+              <w:right w:type="dxa" w:w="100"/>
+            </w:tcMar>
+          </w:tcPr>
+          <w:p>
+            <w:r>
+              <w:rPr>
+                <w:rFonts w:ascii="맑은 고딕" w:cs="맑은 고딕" w:eastAsia="맑은 고딕" w:hAnsi="맑은 고딕"/>
+                <w:b w:val="false"/>
+                <w:bCs w:val="false"/>
+                <w:sz w:val="19"/>
+                <w:szCs w:val="19"/>
+              </w:rPr>
+              <w:t xml:space="preserve">6</w:t>
+            </w:r>
+          </w:p>
+        </w:tc>
+        <w:tc>
+          <w:tcPr>
+            <w:tcW w:type="dxa" w:w="2300"/>
+            <w:tcMar>
+              <w:top w:type="dxa" w:w="60"/>
+              <w:left w:type="dxa" w:w="100"/>
+              <w:bottom w:type="dxa" w:w="60"/>
+              <w:right w:type="dxa" w:w="100"/>
+            </w:tcMar>
+          </w:tcPr>
+          <w:p>
+            <w:r>
+              <w:rPr>
+                <w:rFonts w:ascii="맑은 고딕" w:cs="맑은 고딕" w:eastAsia="맑은 고딕" w:hAnsi="맑은 고딕"/>
+                <w:b w:val="false"/>
+                <w:bCs w:val="false"/>
+                <w:sz w:val="19"/>
+                <w:szCs w:val="19"/>
+              </w:rPr>
+              <w:t xml:space="preserve">경감: 본문을 데이터로 격리, 출력 형식 제약, 실행은 사람 결정</w:t>
+            </w:r>
+          </w:p>
+        </w:tc>
+        <w:tc>
+          <w:tcPr>
+            <w:tcW w:type="dxa" w:w="1700"/>
+            <w:tcMar>
+              <w:top w:type="dxa" w:w="60"/>
+              <w:left w:type="dxa" w:w="100"/>
+              <w:bottom w:type="dxa" w:w="60"/>
+              <w:right w:type="dxa" w:w="100"/>
+            </w:tcMar>
+          </w:tcPr>
+          <w:p>
+            <w:r>
+              <w:rPr>
+                <w:rFonts w:ascii="맑은 고딕" w:cs="맑은 고딕" w:eastAsia="맑은 고딕" w:hAnsi="맑은 고딕"/>
+                <w:b w:val="false"/>
+                <w:bCs w:val="false"/>
+                <w:sz w:val="19"/>
+                <w:szCs w:val="19"/>
+              </w:rPr>
+              <w:t xml:space="preserve">AI엔지니어</w:t>
+            </w:r>
+          </w:p>
+        </w:tc>
+      </w:tr>
+      <w:tr>
+        <w:tc>
+          <w:tcPr>
+            <w:tcW w:type="dxa" w:w="900"/>
+            <w:tcMar>
+              <w:top w:type="dxa" w:w="60"/>
+              <w:left w:type="dxa" w:w="100"/>
+              <w:bottom w:type="dxa" w:w="60"/>
+              <w:right w:type="dxa" w:w="100"/>
+            </w:tcMar>
+          </w:tcPr>
+          <w:p>
+            <w:r>
+              <w:rPr>
+                <w:rFonts w:ascii="맑은 고딕" w:cs="맑은 고딕" w:eastAsia="맑은 고딕" w:hAnsi="맑은 고딕"/>
+                <w:b w:val="false"/>
+                <w:bCs w:val="false"/>
+                <w:sz w:val="19"/>
+                <w:szCs w:val="19"/>
+              </w:rPr>
+              <w:t xml:space="preserve">RISK-09</w:t>
+            </w:r>
+          </w:p>
+        </w:tc>
+        <w:tc>
+          <w:tcPr>
+            <w:tcW w:type="dxa" w:w="2300"/>
+            <w:tcMar>
+              <w:top w:type="dxa" w:w="60"/>
+              <w:left w:type="dxa" w:w="100"/>
+              <w:bottom w:type="dxa" w:w="60"/>
+              <w:right w:type="dxa" w:w="100"/>
+            </w:tcMar>
+          </w:tcPr>
+          <w:p>
+            <w:r>
+              <w:rPr>
+                <w:rFonts w:ascii="맑은 고딕" w:cs="맑은 고딕" w:eastAsia="맑은 고딕" w:hAnsi="맑은 고딕"/>
+                <w:b w:val="false"/>
+                <w:bCs w:val="false"/>
+                <w:sz w:val="19"/>
+                <w:szCs w:val="19"/>
+              </w:rPr>
+              <w:t xml:space="preserve">작성자의 제목 표현 변경(회피 적응) → 미탐 증가</w:t>
+            </w:r>
+          </w:p>
+        </w:tc>
+        <w:tc>
+          <w:tcPr>
+            <w:tcW w:type="dxa" w:w="1000"/>
+            <w:tcMar>
+              <w:top w:type="dxa" w:w="60"/>
+              <w:left w:type="dxa" w:w="100"/>
+              <w:bottom w:type="dxa" w:w="60"/>
+              <w:right w:type="dxa" w:w="100"/>
+            </w:tcMar>
+          </w:tcPr>
+          <w:p>
+            <w:r>
+              <w:rPr>
+                <w:rFonts w:ascii="맑은 고딕" w:cs="맑은 고딕" w:eastAsia="맑은 고딕" w:hAnsi="맑은 고딕"/>
+                <w:b w:val="false"/>
+                <w:bCs w:val="false"/>
+                <w:sz w:val="19"/>
+                <w:szCs w:val="19"/>
+              </w:rPr>
+              <w:t xml:space="preserve">IMPACT-01</w:t>
+            </w:r>
+          </w:p>
+        </w:tc>
+        <w:tc>
+          <w:tcPr>
+            <w:tcW w:type="dxa" w:w="600"/>
+            <w:tcMar>
+              <w:top w:type="dxa" w:w="60"/>
+              <w:left w:type="dxa" w:w="100"/>
+              <w:bottom w:type="dxa" w:w="60"/>
+              <w:right w:type="dxa" w:w="100"/>
+            </w:tcMar>
+          </w:tcPr>
+          <w:p>
+            <w:r>
+              <w:rPr>
+                <w:rFonts w:ascii="맑은 고딕" w:cs="맑은 고딕" w:eastAsia="맑은 고딕" w:hAnsi="맑은 고딕"/>
+                <w:b w:val="false"/>
+                <w:bCs w:val="false"/>
+                <w:sz w:val="19"/>
+                <w:szCs w:val="19"/>
+              </w:rPr>
+              <w:t xml:space="preserve">2</w:t>
+            </w:r>
+          </w:p>
+        </w:tc>
+        <w:tc>
+          <w:tcPr>
+            <w:tcW w:type="dxa" w:w="600"/>
+            <w:tcMar>
+              <w:top w:type="dxa" w:w="60"/>
+              <w:left w:type="dxa" w:w="100"/>
+              <w:bottom w:type="dxa" w:w="60"/>
+              <w:right w:type="dxa" w:w="100"/>
+            </w:tcMar>
+          </w:tcPr>
+          <w:p>
+            <w:r>
+              <w:rPr>
+                <w:rFonts w:ascii="맑은 고딕" w:cs="맑은 고딕" w:eastAsia="맑은 고딕" w:hAnsi="맑은 고딕"/>
+                <w:b w:val="false"/>
+                <w:bCs w:val="false"/>
+                <w:sz w:val="19"/>
+                <w:szCs w:val="19"/>
+              </w:rPr>
+              <w:t xml:space="preserve">2</w:t>
+            </w:r>
+          </w:p>
+        </w:tc>
+        <w:tc>
+          <w:tcPr>
+            <w:tcW w:type="dxa" w:w="600"/>
+            <w:tcMar>
+              <w:top w:type="dxa" w:w="60"/>
+              <w:left w:type="dxa" w:w="100"/>
+              <w:bottom w:type="dxa" w:w="60"/>
+              <w:right w:type="dxa" w:w="100"/>
+            </w:tcMar>
+          </w:tcPr>
+          <w:p>
+            <w:r>
+              <w:rPr>
+                <w:rFonts w:ascii="맑은 고딕" w:cs="맑은 고딕" w:eastAsia="맑은 고딕" w:hAnsi="맑은 고딕"/>
+                <w:b w:val="false"/>
+                <w:bCs w:val="false"/>
+                <w:sz w:val="19"/>
+                <w:szCs w:val="19"/>
+              </w:rPr>
+              <w:t xml:space="preserve">4</w:t>
+            </w:r>
+          </w:p>
+        </w:tc>
+        <w:tc>
+          <w:tcPr>
+            <w:tcW w:type="dxa" w:w="2300"/>
+            <w:tcMar>
+              <w:top w:type="dxa" w:w="60"/>
+              <w:left w:type="dxa" w:w="100"/>
+              <w:bottom w:type="dxa" w:w="60"/>
+              <w:right w:type="dxa" w:w="100"/>
+            </w:tcMar>
+          </w:tcPr>
+          <w:p>
+            <w:r>
+              <w:rPr>
+                <w:rFonts w:ascii="맑은 고딕" w:cs="맑은 고딕" w:eastAsia="맑은 고딕" w:hAnsi="맑은 고딕"/>
+                <w:b w:val="false"/>
+                <w:bCs w:val="false"/>
+                <w:sz w:val="19"/>
+                <w:szCs w:val="19"/>
+              </w:rPr>
+              <w:t xml:space="preserve">경감: 검토 결과 환류, 주기적 재평가, 모델 버전 기록</w:t>
+            </w:r>
+          </w:p>
+        </w:tc>
+        <w:tc>
+          <w:tcPr>
+            <w:tcW w:type="dxa" w:w="1700"/>
+            <w:tcMar>
+              <w:top w:type="dxa" w:w="60"/>
+              <w:left w:type="dxa" w:w="100"/>
+              <w:bottom w:type="dxa" w:w="60"/>
+              <w:right w:type="dxa" w:w="100"/>
+            </w:tcMar>
+          </w:tcPr>
+          <w:p>
+            <w:r>
+              <w:rPr>
+                <w:rFonts w:ascii="맑은 고딕" w:cs="맑은 고딕" w:eastAsia="맑은 고딕" w:hAnsi="맑은 고딕"/>
+                <w:b w:val="false"/>
+                <w:bCs w:val="false"/>
+                <w:sz w:val="19"/>
+                <w:szCs w:val="19"/>
+              </w:rPr>
+              <w:t xml:space="preserve">데이터과학자</w:t>
+            </w:r>
+          </w:p>
+        </w:tc>
+      </w:tr>
+      <w:tr>
+        <w:tc>
+          <w:tcPr>
+            <w:tcW w:type="dxa" w:w="900"/>
+            <w:tcMar>
+              <w:top w:type="dxa" w:w="60"/>
+              <w:left w:type="dxa" w:w="100"/>
+              <w:bottom w:type="dxa" w:w="60"/>
+              <w:right w:type="dxa" w:w="100"/>
+            </w:tcMar>
+          </w:tcPr>
+          <w:p>
+            <w:r>
+              <w:rPr>
+                <w:rFonts w:ascii="맑은 고딕" w:cs="맑은 고딕" w:eastAsia="맑은 고딕" w:hAnsi="맑은 고딕"/>
+                <w:b w:val="false"/>
+                <w:bCs w:val="false"/>
+                <w:sz w:val="19"/>
+                <w:szCs w:val="19"/>
+              </w:rPr>
+              <w:t xml:space="preserve">RISK-10</w:t>
+            </w:r>
+          </w:p>
+        </w:tc>
+        <w:tc>
+          <w:tcPr>
+            <w:tcW w:type="dxa" w:w="2300"/>
+            <w:tcMar>
+              <w:top w:type="dxa" w:w="60"/>
+              <w:left w:type="dxa" w:w="100"/>
+              <w:bottom w:type="dxa" w:w="60"/>
+              <w:right w:type="dxa" w:w="100"/>
+            </w:tcMar>
+          </w:tcPr>
+          <w:p>
+            <w:r>
+              <w:rPr>
+                <w:rFonts w:ascii="맑은 고딕" w:cs="맑은 고딕" w:eastAsia="맑은 고딕" w:hAnsi="맑은 고딕"/>
+                <w:b w:val="false"/>
+                <w:bCs w:val="false"/>
+                <w:sz w:val="19"/>
+                <w:szCs w:val="19"/>
+              </w:rPr>
+              <w:t xml:space="preserve">한국어(메인)·영어(보조) 데이터의 언어·도메인 차이로 성능 편차·편향</w:t>
+            </w:r>
+          </w:p>
+        </w:tc>
+        <w:tc>
+          <w:tcPr>
+            <w:tcW w:type="dxa" w:w="1000"/>
+            <w:tcMar>
+              <w:top w:type="dxa" w:w="60"/>
+              <w:left w:type="dxa" w:w="100"/>
+              <w:bottom w:type="dxa" w:w="60"/>
+              <w:right w:type="dxa" w:w="100"/>
+            </w:tcMar>
+          </w:tcPr>
+          <w:p>
+            <w:r>
+              <w:rPr>
+                <w:rFonts w:ascii="맑은 고딕" w:cs="맑은 고딕" w:eastAsia="맑은 고딕" w:hAnsi="맑은 고딕"/>
+                <w:b w:val="false"/>
+                <w:bCs w:val="false"/>
+                <w:sz w:val="19"/>
+                <w:szCs w:val="19"/>
+              </w:rPr>
+              <w:t xml:space="preserve">IMPACT-02,04</w:t>
+            </w:r>
+          </w:p>
+        </w:tc>
+        <w:tc>
+          <w:tcPr>
+            <w:tcW w:type="dxa" w:w="600"/>
+            <w:tcMar>
+              <w:top w:type="dxa" w:w="60"/>
+              <w:left w:type="dxa" w:w="100"/>
+              <w:bottom w:type="dxa" w:w="60"/>
+              <w:right w:type="dxa" w:w="100"/>
+            </w:tcMar>
+          </w:tcPr>
+          <w:p>
+            <w:r>
+              <w:rPr>
+                <w:rFonts w:ascii="맑은 고딕" w:cs="맑은 고딕" w:eastAsia="맑은 고딕" w:hAnsi="맑은 고딕"/>
+                <w:b w:val="false"/>
+                <w:bCs w:val="false"/>
+                <w:sz w:val="19"/>
+                <w:szCs w:val="19"/>
+              </w:rPr>
+              <w:t xml:space="preserve">3</w:t>
+            </w:r>
+          </w:p>
+        </w:tc>
+        <w:tc>
+          <w:tcPr>
+            <w:tcW w:type="dxa" w:w="600"/>
+            <w:tcMar>
+              <w:top w:type="dxa" w:w="60"/>
+              <w:left w:type="dxa" w:w="100"/>
+              <w:bottom w:type="dxa" w:w="60"/>
+              <w:right w:type="dxa" w:w="100"/>
+            </w:tcMar>
+          </w:tcPr>
+          <w:p>
+            <w:r>
+              <w:rPr>
+                <w:rFonts w:ascii="맑은 고딕" w:cs="맑은 고딕" w:eastAsia="맑은 고딕" w:hAnsi="맑은 고딕"/>
+                <w:b w:val="false"/>
+                <w:bCs w:val="false"/>
+                <w:sz w:val="19"/>
+                <w:szCs w:val="19"/>
+              </w:rPr>
+              <w:t xml:space="preserve">2</w:t>
+            </w:r>
+          </w:p>
+        </w:tc>
+        <w:tc>
+          <w:tcPr>
+            <w:tcW w:type="dxa" w:w="600"/>
+            <w:tcMar>
+              <w:top w:type="dxa" w:w="60"/>
+              <w:left w:type="dxa" w:w="100"/>
+              <w:bottom w:type="dxa" w:w="60"/>
+              <w:right w:type="dxa" w:w="100"/>
+            </w:tcMar>
+          </w:tcPr>
+          <w:p>
+            <w:r>
+              <w:rPr>
+                <w:rFonts w:ascii="맑은 고딕" w:cs="맑은 고딕" w:eastAsia="맑은 고딕" w:hAnsi="맑은 고딕"/>
+                <w:b w:val="false"/>
+                <w:bCs w:val="false"/>
+                <w:sz w:val="19"/>
+                <w:szCs w:val="19"/>
+              </w:rPr>
+              <w:t xml:space="preserve">6</w:t>
+            </w:r>
+          </w:p>
+        </w:tc>
+        <w:tc>
+          <w:tcPr>
+            <w:tcW w:type="dxa" w:w="2300"/>
+            <w:tcMar>
+              <w:top w:type="dxa" w:w="60"/>
+              <w:left w:type="dxa" w:w="100"/>
+              <w:bottom w:type="dxa" w:w="60"/>
+              <w:right w:type="dxa" w:w="100"/>
+            </w:tcMar>
+          </w:tcPr>
+          <w:p>
+            <w:r>
+              <w:rPr>
+                <w:rFonts w:ascii="맑은 고딕" w:cs="맑은 고딕" w:eastAsia="맑은 고딕" w:hAnsi="맑은 고딕"/>
+                <w:b w:val="false"/>
+                <w:bCs w:val="false"/>
+                <w:sz w:val="19"/>
+                <w:szCs w:val="19"/>
+              </w:rPr>
+              <w:t xml:space="preserve">경감: 목적별 분리, 한국어 검증셋 평가·보정, 언론사·주제별 성능 분해</w:t>
+            </w:r>
+          </w:p>
+        </w:tc>
+        <w:tc>
+          <w:tcPr>
+            <w:tcW w:type="dxa" w:w="1700"/>
+            <w:tcMar>
+              <w:top w:type="dxa" w:w="60"/>
+              <w:left w:type="dxa" w:w="100"/>
+              <w:bottom w:type="dxa" w:w="60"/>
+              <w:right w:type="dxa" w:w="100"/>
+            </w:tcMar>
+          </w:tcPr>
+          <w:p>
+            <w:r>
+              <w:rPr>
+                <w:rFonts w:ascii="맑은 고딕" w:cs="맑은 고딕" w:eastAsia="맑은 고딕" w:hAnsi="맑은 고딕"/>
+                <w:b w:val="false"/>
+                <w:bCs w:val="false"/>
+                <w:sz w:val="19"/>
+                <w:szCs w:val="19"/>
+              </w:rPr>
+              <w:t xml:space="preserve">데이터과학자</w:t>
+            </w:r>
+          </w:p>
+        </w:tc>
+      </w:tr>
+      <w:tr>
+        <w:tc>
+          <w:tcPr>
+            <w:tcW w:type="dxa" w:w="900"/>
+            <w:tcMar>
+              <w:top w:type="dxa" w:w="60"/>
+              <w:left w:type="dxa" w:w="100"/>
+              <w:bottom w:type="dxa" w:w="60"/>
+              <w:right w:type="dxa" w:w="100"/>
+            </w:tcMar>
+          </w:tcPr>
+          <w:p>
+            <w:r>
+              <w:rPr>
+                <w:rFonts w:ascii="맑은 고딕" w:cs="맑은 고딕" w:eastAsia="맑은 고딕" w:hAnsi="맑은 고딕"/>
+                <w:b w:val="false"/>
+                <w:bCs w:val="false"/>
+                <w:sz w:val="19"/>
+                <w:szCs w:val="19"/>
+              </w:rPr>
+              <w:t xml:space="preserve">RISK-11</w:t>
+            </w:r>
+          </w:p>
+        </w:tc>
+        <w:tc>
+          <w:tcPr>
+            <w:tcW w:type="dxa" w:w="2300"/>
+            <w:tcMar>
+              <w:top w:type="dxa" w:w="60"/>
+              <w:left w:type="dxa" w:w="100"/>
+              <w:bottom w:type="dxa" w:w="60"/>
+              <w:right w:type="dxa" w:w="100"/>
+            </w:tcMar>
+          </w:tcPr>
+          <w:p>
+            <w:r>
+              <w:rPr>
+                <w:rFonts w:ascii="맑은 고딕" w:cs="맑은 고딕" w:eastAsia="맑은 고딕" w:hAnsi="맑은 고딕"/>
+                <w:b w:val="false"/>
+                <w:bCs w:val="false"/>
+                <w:sz w:val="19"/>
+                <w:szCs w:val="19"/>
+              </w:rPr>
+              <w:t xml:space="preserve">시간 경과(신조어·제목 유행)로 성능 저하(드리프트)</w:t>
+            </w:r>
+          </w:p>
+        </w:tc>
+        <w:tc>
+          <w:tcPr>
+            <w:tcW w:type="dxa" w:w="1000"/>
+            <w:tcMar>
+              <w:top w:type="dxa" w:w="60"/>
+              <w:left w:type="dxa" w:w="100"/>
+              <w:bottom w:type="dxa" w:w="60"/>
+              <w:right w:type="dxa" w:w="100"/>
+            </w:tcMar>
+          </w:tcPr>
+          <w:p>
+            <w:r>
+              <w:rPr>
+                <w:rFonts w:ascii="맑은 고딕" w:cs="맑은 고딕" w:eastAsia="맑은 고딕" w:hAnsi="맑은 고딕"/>
+                <w:b w:val="false"/>
+                <w:bCs w:val="false"/>
+                <w:sz w:val="19"/>
+                <w:szCs w:val="19"/>
+              </w:rPr>
+              <w:t xml:space="preserve">IMPACT-01</w:t>
+            </w:r>
+          </w:p>
+        </w:tc>
+        <w:tc>
+          <w:tcPr>
+            <w:tcW w:type="dxa" w:w="600"/>
+            <w:tcMar>
+              <w:top w:type="dxa" w:w="60"/>
+              <w:left w:type="dxa" w:w="100"/>
+              <w:bottom w:type="dxa" w:w="60"/>
+              <w:right w:type="dxa" w:w="100"/>
+            </w:tcMar>
+          </w:tcPr>
+          <w:p>
+            <w:r>
+              <w:rPr>
+                <w:rFonts w:ascii="맑은 고딕" w:cs="맑은 고딕" w:eastAsia="맑은 고딕" w:hAnsi="맑은 고딕"/>
+                <w:b w:val="false"/>
+                <w:bCs w:val="false"/>
+                <w:sz w:val="19"/>
+                <w:szCs w:val="19"/>
+              </w:rPr>
+              <w:t xml:space="preserve">2</w:t>
+            </w:r>
+          </w:p>
+        </w:tc>
+        <w:tc>
+          <w:tcPr>
+            <w:tcW w:type="dxa" w:w="600"/>
+            <w:tcMar>
+              <w:top w:type="dxa" w:w="60"/>
+              <w:left w:type="dxa" w:w="100"/>
+              <w:bottom w:type="dxa" w:w="60"/>
+              <w:right w:type="dxa" w:w="100"/>
+            </w:tcMar>
+          </w:tcPr>
+          <w:p>
+            <w:r>
+              <w:rPr>
+                <w:rFonts w:ascii="맑은 고딕" w:cs="맑은 고딕" w:eastAsia="맑은 고딕" w:hAnsi="맑은 고딕"/>
+                <w:b w:val="false"/>
+                <w:bCs w:val="false"/>
+                <w:sz w:val="19"/>
+                <w:szCs w:val="19"/>
+              </w:rPr>
+              <w:t xml:space="preserve">2</w:t>
+            </w:r>
+          </w:p>
+        </w:tc>
+        <w:tc>
+          <w:tcPr>
+            <w:tcW w:type="dxa" w:w="600"/>
+            <w:tcMar>
+              <w:top w:type="dxa" w:w="60"/>
+              <w:left w:type="dxa" w:w="100"/>
+              <w:bottom w:type="dxa" w:w="60"/>
+              <w:right w:type="dxa" w:w="100"/>
+            </w:tcMar>
+          </w:tcPr>
+          <w:p>
+            <w:r>
+              <w:rPr>
+                <w:rFonts w:ascii="맑은 고딕" w:cs="맑은 고딕" w:eastAsia="맑은 고딕" w:hAnsi="맑은 고딕"/>
+                <w:b w:val="false"/>
+                <w:bCs w:val="false"/>
+                <w:sz w:val="19"/>
+                <w:szCs w:val="19"/>
+              </w:rPr>
+              <w:t xml:space="preserve">4</w:t>
+            </w:r>
+          </w:p>
+        </w:tc>
+        <w:tc>
+          <w:tcPr>
+            <w:tcW w:type="dxa" w:w="2300"/>
+            <w:tcMar>
+              <w:top w:type="dxa" w:w="60"/>
+              <w:left w:type="dxa" w:w="100"/>
+              <w:bottom w:type="dxa" w:w="60"/>
+              <w:right w:type="dxa" w:w="100"/>
+            </w:tcMar>
+          </w:tcPr>
+          <w:p>
+            <w:r>
+              <w:rPr>
+                <w:rFonts w:ascii="맑은 고딕" w:cs="맑은 고딕" w:eastAsia="맑은 고딕" w:hAnsi="맑은 고딕"/>
+                <w:b w:val="false"/>
+                <w:bCs w:val="false"/>
+                <w:sz w:val="19"/>
+                <w:szCs w:val="19"/>
+              </w:rPr>
+              <w:t xml:space="preserve">경감: 주기적 재평가, 임계값·보정 재조정 이력 기록</w:t>
+            </w:r>
+          </w:p>
+        </w:tc>
+        <w:tc>
+          <w:tcPr>
+            <w:tcW w:type="dxa" w:w="1700"/>
+            <w:tcMar>
+              <w:top w:type="dxa" w:w="60"/>
+              <w:left w:type="dxa" w:w="100"/>
+              <w:bottom w:type="dxa" w:w="60"/>
+              <w:right w:type="dxa" w:w="100"/>
+            </w:tcMar>
+          </w:tcPr>
+          <w:p>
+            <w:r>
+              <w:rPr>
+                <w:rFonts w:ascii="맑은 고딕" w:cs="맑은 고딕" w:eastAsia="맑은 고딕" w:hAnsi="맑은 고딕"/>
+                <w:b w:val="false"/>
+                <w:bCs w:val="false"/>
+                <w:sz w:val="19"/>
+                <w:szCs w:val="19"/>
+              </w:rPr>
+              <w:t xml:space="preserve">데이터과학자·AI엔지니어</w:t>
+            </w:r>
+          </w:p>
+        </w:tc>
+      </w:tr>
+      <w:tr>
+        <w:tc>
+          <w:tcPr>
+            <w:tcW w:type="dxa" w:w="900"/>
+            <w:tcMar>
+              <w:top w:type="dxa" w:w="60"/>
+              <w:left w:type="dxa" w:w="100"/>
+              <w:bottom w:type="dxa" w:w="60"/>
+              <w:right w:type="dxa" w:w="100"/>
+            </w:tcMar>
+          </w:tcPr>
+          <w:p>
+            <w:r>
+              <w:rPr>
+                <w:rFonts w:ascii="맑은 고딕" w:cs="맑은 고딕" w:eastAsia="맑은 고딕" w:hAnsi="맑은 고딕"/>
+                <w:b w:val="false"/>
+                <w:bCs w:val="false"/>
+                <w:sz w:val="19"/>
+                <w:szCs w:val="19"/>
+              </w:rPr>
+              <w:t xml:space="preserve">RISK-12</w:t>
+            </w:r>
+          </w:p>
+        </w:tc>
+        <w:tc>
+          <w:tcPr>
+            <w:tcW w:type="dxa" w:w="2300"/>
+            <w:tcMar>
+              <w:top w:type="dxa" w:w="60"/>
+              <w:left w:type="dxa" w:w="100"/>
+              <w:bottom w:type="dxa" w:w="60"/>
+              <w:right w:type="dxa" w:w="100"/>
+            </w:tcMar>
+          </w:tcPr>
+          <w:p>
+            <w:r>
+              <w:rPr>
+                <w:rFonts w:ascii="맑은 고딕" w:cs="맑은 고딕" w:eastAsia="맑은 고딕" w:hAnsi="맑은 고딕"/>
+                <w:b w:val="false"/>
+                <w:bCs w:val="false"/>
+                <w:sz w:val="19"/>
+                <w:szCs w:val="19"/>
+              </w:rPr>
+              <w:t xml:space="preserve">② 검증 Agent의 외부 검색(RAG)에서 신뢰할 수 없는 출처 인용·검색 결과 오염 (확장 기능, 개념 수준)</w:t>
+            </w:r>
+          </w:p>
+        </w:tc>
+        <w:tc>
+          <w:tcPr>
+            <w:tcW w:type="dxa" w:w="1000"/>
+            <w:tcMar>
+              <w:top w:type="dxa" w:w="60"/>
+              <w:left w:type="dxa" w:w="100"/>
+              <w:bottom w:type="dxa" w:w="60"/>
+              <w:right w:type="dxa" w:w="100"/>
+            </w:tcMar>
+          </w:tcPr>
+          <w:p>
+            <w:r>
+              <w:rPr>
+                <w:rFonts w:ascii="맑은 고딕" w:cs="맑은 고딕" w:eastAsia="맑은 고딕" w:hAnsi="맑은 고딕"/>
+                <w:b w:val="false"/>
+                <w:bCs w:val="false"/>
+                <w:sz w:val="19"/>
+                <w:szCs w:val="19"/>
+              </w:rPr>
+              <w:t xml:space="preserve">IMPACT-01,02</w:t>
+            </w:r>
+          </w:p>
+        </w:tc>
+        <w:tc>
+          <w:tcPr>
+            <w:tcW w:type="dxa" w:w="600"/>
+            <w:tcMar>
+              <w:top w:type="dxa" w:w="60"/>
+              <w:left w:type="dxa" w:w="100"/>
+              <w:bottom w:type="dxa" w:w="60"/>
+              <w:right w:type="dxa" w:w="100"/>
+            </w:tcMar>
+          </w:tcPr>
+          <w:p>
+            <w:r>
+              <w:rPr>
+                <w:rFonts w:ascii="맑은 고딕" w:cs="맑은 고딕" w:eastAsia="맑은 고딕" w:hAnsi="맑은 고딕"/>
+                <w:b w:val="false"/>
+                <w:bCs w:val="false"/>
+                <w:sz w:val="19"/>
+                <w:szCs w:val="19"/>
+              </w:rPr>
+              <w:t xml:space="preserve">2</w:t>
+            </w:r>
+          </w:p>
+        </w:tc>
+        <w:tc>
+          <w:tcPr>
+            <w:tcW w:type="dxa" w:w="600"/>
+            <w:tcMar>
+              <w:top w:type="dxa" w:w="60"/>
+              <w:left w:type="dxa" w:w="100"/>
+              <w:bottom w:type="dxa" w:w="60"/>
+              <w:right w:type="dxa" w:w="100"/>
+            </w:tcMar>
+          </w:tcPr>
+          <w:p>
+            <w:r>
+              <w:rPr>
+                <w:rFonts w:ascii="맑은 고딕" w:cs="맑은 고딕" w:eastAsia="맑은 고딕" w:hAnsi="맑은 고딕"/>
+                <w:b w:val="false"/>
+                <w:bCs w:val="false"/>
+                <w:sz w:val="19"/>
+                <w:szCs w:val="19"/>
+              </w:rPr>
+              <w:t xml:space="preserve">2</w:t>
+            </w:r>
+          </w:p>
+        </w:tc>
+        <w:tc>
+          <w:tcPr>
+            <w:tcW w:type="dxa" w:w="600"/>
+            <w:tcMar>
+              <w:top w:type="dxa" w:w="60"/>
+              <w:left w:type="dxa" w:w="100"/>
+              <w:bottom w:type="dxa" w:w="60"/>
+              <w:right w:type="dxa" w:w="100"/>
+            </w:tcMar>
+          </w:tcPr>
+          <w:p>
+            <w:r>
+              <w:rPr>
+                <w:rFonts w:ascii="맑은 고딕" w:cs="맑은 고딕" w:eastAsia="맑은 고딕" w:hAnsi="맑은 고딕"/>
+                <w:b w:val="false"/>
+                <w:bCs w:val="false"/>
+                <w:sz w:val="19"/>
+                <w:szCs w:val="19"/>
+              </w:rPr>
+              <w:t xml:space="preserve">4</w:t>
+            </w:r>
+          </w:p>
+        </w:tc>
+        <w:tc>
+          <w:tcPr>
+            <w:tcW w:type="dxa" w:w="2300"/>
+            <w:tcMar>
+              <w:top w:type="dxa" w:w="60"/>
+              <w:left w:type="dxa" w:w="100"/>
+              <w:bottom w:type="dxa" w:w="60"/>
+              <w:right w:type="dxa" w:w="100"/>
+            </w:tcMar>
+          </w:tcPr>
+          <w:p>
+            <w:r>
+              <w:rPr>
+                <w:rFonts w:ascii="맑은 고딕" w:cs="맑은 고딕" w:eastAsia="맑은 고딕" w:hAnsi="맑은 고딕"/>
+                <w:b w:val="false"/>
+                <w:bCs w:val="false"/>
+                <w:sz w:val="19"/>
+                <w:szCs w:val="19"/>
+              </w:rPr>
+              <w:t xml:space="preserve">경감: 출처 화이트리스트·링크 병기, 검색 결과 격리, 최종 사실 판단은 사람</w:t>
+            </w:r>
+          </w:p>
+        </w:tc>
+        <w:tc>
+          <w:tcPr>
+            <w:tcW w:type="dxa" w:w="1700"/>
+            <w:tcMar>
+              <w:top w:type="dxa" w:w="60"/>
+              <w:left w:type="dxa" w:w="100"/>
+              <w:bottom w:type="dxa" w:w="60"/>
+              <w:right w:type="dxa" w:w="100"/>
+            </w:tcMar>
+          </w:tcPr>
+          <w:p>
+            <w:r>
+              <w:rPr>
+                <w:rFonts w:ascii="맑은 고딕" w:cs="맑은 고딕" w:eastAsia="맑은 고딕" w:hAnsi="맑은 고딕"/>
+                <w:b w:val="false"/>
+                <w:bCs w:val="false"/>
+                <w:sz w:val="19"/>
+                <w:szCs w:val="19"/>
+              </w:rPr>
+              <w:t xml:space="preserve">AI엔지니어</w:t>
             </w:r>
           </w:p>
         </w:tc>
@@ -6398,6 +7384,194 @@
                 <w:szCs w:val="19"/>
               </w:rPr>
               <w:t xml:space="preserve">사실 검증은 ② 검증 Agent 영역. “사실 여부를 보증하지 않는다”는 점을 검토자에게 고지</w:t>
+            </w:r>
+          </w:p>
+        </w:tc>
+      </w:tr>
+      <w:tr>
+        <w:tc>
+          <w:tcPr>
+            <w:tcW w:type="dxa" w:w="1100"/>
+            <w:tcMar>
+              <w:top w:type="dxa" w:w="60"/>
+              <w:left w:type="dxa" w:w="100"/>
+              <w:bottom w:type="dxa" w:w="60"/>
+              <w:right w:type="dxa" w:w="100"/>
+            </w:tcMar>
+          </w:tcPr>
+          <w:p>
+            <w:r>
+              <w:rPr>
+                <w:rFonts w:ascii="맑은 고딕" w:cs="맑은 고딕" w:eastAsia="맑은 고딕" w:hAnsi="맑은 고딕"/>
+                <w:b w:val="false"/>
+                <w:bCs w:val="false"/>
+                <w:sz w:val="19"/>
+                <w:szCs w:val="19"/>
+              </w:rPr>
+              <w:t xml:space="preserve">RISK-08</w:t>
+            </w:r>
+          </w:p>
+        </w:tc>
+        <w:tc>
+          <w:tcPr>
+            <w:tcW w:type="dxa" w:w="3900"/>
+            <w:tcMar>
+              <w:top w:type="dxa" w:w="60"/>
+              <w:left w:type="dxa" w:w="100"/>
+              <w:bottom w:type="dxa" w:w="60"/>
+              <w:right w:type="dxa" w:w="100"/>
+            </w:tcMar>
+          </w:tcPr>
+          <w:p>
+            <w:r>
+              <w:rPr>
+                <w:rFonts w:ascii="맑은 고딕" w:cs="맑은 고딕" w:eastAsia="맑은 고딕" w:hAnsi="맑은 고딕"/>
+                <w:b w:val="false"/>
+                <w:bCs w:val="false"/>
+                <w:sz w:val="19"/>
+                <w:szCs w:val="19"/>
+              </w:rPr>
+              <w:t xml:space="preserve">인젝션 기법이 진화해 완전 차단은 어려움</w:t>
+            </w:r>
+          </w:p>
+        </w:tc>
+        <w:tc>
+          <w:tcPr>
+            <w:tcW w:type="dxa" w:w="1500"/>
+            <w:tcMar>
+              <w:top w:type="dxa" w:w="60"/>
+              <w:left w:type="dxa" w:w="100"/>
+              <w:bottom w:type="dxa" w:w="60"/>
+              <w:right w:type="dxa" w:w="100"/>
+            </w:tcMar>
+          </w:tcPr>
+          <w:p>
+            <w:r>
+              <w:rPr>
+                <w:rFonts w:ascii="맑은 고딕" w:cs="맑은 고딕" w:eastAsia="맑은 고딕" w:hAnsi="맑은 고딕"/>
+                <w:b w:val="false"/>
+                <w:bCs w:val="false"/>
+                <w:sz w:val="19"/>
+                <w:szCs w:val="19"/>
+              </w:rPr>
+              <w:t xml:space="preserve">수용(모니터링)</w:t>
+            </w:r>
+          </w:p>
+        </w:tc>
+        <w:tc>
+          <w:tcPr>
+            <w:tcW w:type="dxa" w:w="3400"/>
+            <w:tcMar>
+              <w:top w:type="dxa" w:w="60"/>
+              <w:left w:type="dxa" w:w="100"/>
+              <w:bottom w:type="dxa" w:w="60"/>
+              <w:right w:type="dxa" w:w="100"/>
+            </w:tcMar>
+          </w:tcPr>
+          <w:p>
+            <w:r>
+              <w:rPr>
+                <w:rFonts w:ascii="맑은 고딕" w:cs="맑은 고딕" w:eastAsia="맑은 고딕" w:hAnsi="맑은 고딕"/>
+                <w:b w:val="false"/>
+                <w:bCs w:val="false"/>
+                <w:sz w:val="19"/>
+                <w:szCs w:val="19"/>
+              </w:rPr>
+              <w:t xml:space="preserve">입력 격리·출력 제약과 사람 결정 단계로 피해 확산 제한, 검토자 신고 사례를 통제 개선에 반영</w:t>
+            </w:r>
+          </w:p>
+        </w:tc>
+      </w:tr>
+      <w:tr>
+        <w:tc>
+          <w:tcPr>
+            <w:tcW w:type="dxa" w:w="1100"/>
+            <w:tcMar>
+              <w:top w:type="dxa" w:w="60"/>
+              <w:left w:type="dxa" w:w="100"/>
+              <w:bottom w:type="dxa" w:w="60"/>
+              <w:right w:type="dxa" w:w="100"/>
+            </w:tcMar>
+          </w:tcPr>
+          <w:p>
+            <w:r>
+              <w:rPr>
+                <w:rFonts w:ascii="맑은 고딕" w:cs="맑은 고딕" w:eastAsia="맑은 고딕" w:hAnsi="맑은 고딕"/>
+                <w:b w:val="false"/>
+                <w:bCs w:val="false"/>
+                <w:sz w:val="19"/>
+                <w:szCs w:val="19"/>
+              </w:rPr>
+              <w:t xml:space="preserve">RISK-10</w:t>
+            </w:r>
+          </w:p>
+        </w:tc>
+        <w:tc>
+          <w:tcPr>
+            <w:tcW w:type="dxa" w:w="3900"/>
+            <w:tcMar>
+              <w:top w:type="dxa" w:w="60"/>
+              <w:left w:type="dxa" w:w="100"/>
+              <w:bottom w:type="dxa" w:w="60"/>
+              <w:right w:type="dxa" w:w="100"/>
+            </w:tcMar>
+          </w:tcPr>
+          <w:p>
+            <w:r>
+              <w:rPr>
+                <w:rFonts w:ascii="맑은 고딕" w:cs="맑은 고딕" w:eastAsia="맑은 고딕" w:hAnsi="맑은 고딕"/>
+                <w:b w:val="false"/>
+                <w:bCs w:val="false"/>
+                <w:sz w:val="19"/>
+                <w:szCs w:val="19"/>
+              </w:rPr>
+              <w:t xml:space="preserve">영어 보조 데이터의 기준이 한국어 기사에 그대로 맞지 않을 가능성</w:t>
+            </w:r>
+          </w:p>
+        </w:tc>
+        <w:tc>
+          <w:tcPr>
+            <w:tcW w:type="dxa" w:w="1500"/>
+            <w:tcMar>
+              <w:top w:type="dxa" w:w="60"/>
+              <w:left w:type="dxa" w:w="100"/>
+              <w:bottom w:type="dxa" w:w="60"/>
+              <w:right w:type="dxa" w:w="100"/>
+            </w:tcMar>
+          </w:tcPr>
+          <w:p>
+            <w:r>
+              <w:rPr>
+                <w:rFonts w:ascii="맑은 고딕" w:cs="맑은 고딕" w:eastAsia="맑은 고딕" w:hAnsi="맑은 고딕"/>
+                <w:b w:val="false"/>
+                <w:bCs w:val="false"/>
+                <w:sz w:val="19"/>
+                <w:szCs w:val="19"/>
+              </w:rPr>
+              <w:t xml:space="preserve">수용(검증 후 조정)</w:t>
+            </w:r>
+          </w:p>
+        </w:tc>
+        <w:tc>
+          <w:tcPr>
+            <w:tcW w:type="dxa" w:w="3400"/>
+            <w:tcMar>
+              <w:top w:type="dxa" w:w="60"/>
+              <w:left w:type="dxa" w:w="100"/>
+              <w:bottom w:type="dxa" w:w="60"/>
+              <w:right w:type="dxa" w:w="100"/>
+            </w:tcMar>
+          </w:tcPr>
+          <w:p>
+            <w:r>
+              <w:rPr>
+                <w:rFonts w:ascii="맑은 고딕" w:cs="맑은 고딕" w:eastAsia="맑은 고딕" w:hAnsi="맑은 고딕"/>
+                <w:b w:val="false"/>
+                <w:bCs w:val="false"/>
+                <w:sz w:val="19"/>
+                <w:szCs w:val="19"/>
+              </w:rPr>
+              <w:t xml:space="preserve">보조 데이터는 인간 검토 기준 설정·비교용으로만 사용, 최종 평가는 한국어 데이터 기준</w:t>
             </w:r>
           </w:p>
         </w:tc>
@@ -6452,7 +7626,7 @@
         <w:rPr>
           <w:rFonts w:ascii="맑은 고딕" w:cs="맑은 고딕" w:eastAsia="맑은 고딕" w:hAnsi="맑은 고딕"/>
         </w:rPr>
-        <w:t xml:space="preserve">경감: 기술적·프로세스적 완화 조치 (RISK-01, 02, 03, 06)</w:t>
+        <w:t xml:space="preserve">경감: 기술적·프로세스적 완화 조치 (RISK-01, 02, 03, 06, 08, 09, 10, 11, 12)</w:t>
       </w:r>
     </w:p>
     <w:p>
@@ -6651,7 +7825,7 @@
                 <w:sz w:val="19"/>
                 <w:szCs w:val="19"/>
               </w:rPr>
-              <w:t xml:space="preserve">재현율(클릭베이트를 놓치지 않는 것)을 우선하되, 그 대가로 늘어나는 오탐·과잉 차단은 애매한 구간(신뢰도 0.4~0.6, 초기값)을 전부 사람에게 이관하는 방식으로 제어</w:t>
+              <w:t xml:space="preserve">재현율(클릭베이트를 놓치지 않는 것)을 우선하되, 그 대가로 늘어나는 오탐·과잉 차단은 애매한 경우(conformal 예측집합이 {클릭베이트, 정상}을 모두 포함하거나 공집합인 경우)를 전부 사람에게 이관하는 방식으로 제어</w:t>
             </w:r>
           </w:p>
         </w:tc>
@@ -7022,7 +8196,7 @@
                 <w:sz w:val="19"/>
                 <w:szCs w:val="19"/>
               </w:rPr>
-              <w:t xml:space="preserve">신뢰도 임계값</w:t>
+              <w:t xml:space="preserve">애매 구간 판정 (Conformal)</w:t>
             </w:r>
           </w:p>
         </w:tc>
@@ -7045,7 +8219,7 @@
                 <w:sz w:val="19"/>
                 <w:szCs w:val="19"/>
               </w:rPr>
-              <w:t xml:space="preserve">신뢰도 0.4~0.6 구간(초기값)을 “애매함”으로 분류해 자동판정하지 않고 인간에게 이관. 신뢰도 보정 결과와 검증 데이터로 재조정</w:t>
+              <w:t xml:space="preserve">한국어 보정 셋(AI-Hub 일부, 튜닝·테스트와 분리)에서 비적합도 s(x,y)=1−p̂(y∣x)의 분위수 q̂를 계산하고, 예측집합이 {클릭베이트, 정상}을 모두 포함하거나 공집합이면 “애매함”으로 보고 자동판정하지 않고 인간에게 이관</w:t>
             </w:r>
           </w:p>
         </w:tc>
@@ -7070,7 +8244,7 @@
                 <w:sz w:val="19"/>
                 <w:szCs w:val="19"/>
               </w:rPr>
-              <w:t xml:space="preserve">신뢰도 보정</w:t>
+              <w:t xml:space="preserve">보장과 허용 오류(α)</w:t>
             </w:r>
           </w:p>
         </w:tc>
@@ -7093,7 +8267,7 @@
                 <w:sz w:val="19"/>
                 <w:szCs w:val="19"/>
               </w:rPr>
-              <w:t xml:space="preserve">AI가 출력하는 신뢰도가 실제 정답률과 맞는지 검증 데이터로 점검(신뢰도 구간별 정답률, ECE 등)하고 필요시 보정. 보정되지 않은 신뢰도로는 “애매한 구간”의 의미가 성립하지 않으므로 임계값의 전제 조건으로 둠</w:t>
+              <w:t xml:space="preserve">클래스 조건부(Mondrian) conformal로 P(클릭베이트 ∈ C(x) ∣ 정답=클릭베이트) ≥ 1−α 확보(= 확정 판정 또는 인간 이관에 포함). α는 “놓칠 확률 허용치”로 재현율 우선과 오탐 증가(검토 부담) 사이의 위험 허용도 파라미터이며 AI기획자가 정하고 근거를 기록</w:t>
             </w:r>
           </w:p>
         </w:tc>
@@ -7118,7 +8292,7 @@
                 <w:sz w:val="19"/>
                 <w:szCs w:val="19"/>
               </w:rPr>
-              <w:t xml:space="preserve">임계값 설정 주체</w:t>
+              <w:t xml:space="preserve">전제와 한계</w:t>
             </w:r>
           </w:p>
         </w:tc>
@@ -7141,7 +8315,7 @@
                 <w:sz w:val="19"/>
                 <w:szCs w:val="19"/>
               </w:rPr>
-              <w:t xml:space="preserve">AI기획자가 초기값을 정하고 팀 논의로 확정 — “정확하다”는 팀이 운영적으로 정의한 합의값</w:t>
+              <w:t xml:space="preserve">보장은 교환가능성(보정 셋과 운영 데이터가 같은 분포)을 전제로 한 주변(marginal) 보장이며 개별 기사·하위집단별 보장은 아님. 한국어 AI-Hub만 보정에 사용(영어 Webis는 분포가 달라 제외), 분포 변화(RISK-10·11) 시 보정 셋 갱신</w:t>
             </w:r>
           </w:p>
         </w:tc>
@@ -7166,6 +8340,102 @@
                 <w:sz w:val="19"/>
                 <w:szCs w:val="19"/>
               </w:rPr>
+              <w:t xml:space="preserve">확률 품질 점검</w:t>
+            </w:r>
+          </w:p>
+        </w:tc>
+        <w:tc>
+          <w:tcPr>
+            <w:tcW w:type="dxa" w:w="7600"/>
+            <w:tcMar>
+              <w:top w:type="dxa" w:w="60"/>
+              <w:left w:type="dxa" w:w="100"/>
+              <w:bottom w:type="dxa" w:w="60"/>
+              <w:right w:type="dxa" w:w="100"/>
+            </w:tcMar>
+          </w:tcPr>
+          <w:p>
+            <w:r>
+              <w:rPr>
+                <w:rFonts w:ascii="맑은 고딕" w:cs="맑은 고딕" w:eastAsia="맑은 고딕" w:hAnsi="맑은 고딕"/>
+                <w:b w:val="false"/>
+                <w:bCs w:val="false"/>
+                <w:sz w:val="19"/>
+                <w:szCs w:val="19"/>
+              </w:rPr>
+              <w:t xml:space="preserve">conformal의 비적합도에 쓰는 라벨 토큰 확률이 실제 정답률과 맞는지 점검(확률 구간별 정답률, ECE)하여 점수의 품질 확인</w:t>
+            </w:r>
+          </w:p>
+        </w:tc>
+      </w:tr>
+      <w:tr>
+        <w:tc>
+          <w:tcPr>
+            <w:tcW w:type="dxa" w:w="2000"/>
+            <w:tcMar>
+              <w:top w:type="dxa" w:w="60"/>
+              <w:left w:type="dxa" w:w="100"/>
+              <w:bottom w:type="dxa" w:w="60"/>
+              <w:right w:type="dxa" w:w="100"/>
+            </w:tcMar>
+          </w:tcPr>
+          <w:p>
+            <w:r>
+              <w:rPr>
+                <w:rFonts w:ascii="맑은 고딕" w:cs="맑은 고딕" w:eastAsia="맑은 고딕" w:hAnsi="맑은 고딕"/>
+                <w:b w:val="false"/>
+                <w:bCs w:val="false"/>
+                <w:sz w:val="19"/>
+                <w:szCs w:val="19"/>
+              </w:rPr>
+              <w:t xml:space="preserve">임계값 설정 주체</w:t>
+            </w:r>
+          </w:p>
+        </w:tc>
+        <w:tc>
+          <w:tcPr>
+            <w:tcW w:type="dxa" w:w="7600"/>
+            <w:tcMar>
+              <w:top w:type="dxa" w:w="60"/>
+              <w:left w:type="dxa" w:w="100"/>
+              <w:bottom w:type="dxa" w:w="60"/>
+              <w:right w:type="dxa" w:w="100"/>
+            </w:tcMar>
+          </w:tcPr>
+          <w:p>
+            <w:r>
+              <w:rPr>
+                <w:rFonts w:ascii="맑은 고딕" w:cs="맑은 고딕" w:eastAsia="맑은 고딕" w:hAnsi="맑은 고딕"/>
+                <w:b w:val="false"/>
+                <w:bCs w:val="false"/>
+                <w:sz w:val="19"/>
+                <w:szCs w:val="19"/>
+              </w:rPr>
+              <w:t xml:space="preserve">AI기획자가 초기값을 정하고 팀 논의로 확정 — “정확하다”는 팀이 운영적으로 정의한 합의값</w:t>
+            </w:r>
+          </w:p>
+        </w:tc>
+      </w:tr>
+      <w:tr>
+        <w:tc>
+          <w:tcPr>
+            <w:tcW w:type="dxa" w:w="2000"/>
+            <w:tcMar>
+              <w:top w:type="dxa" w:w="60"/>
+              <w:left w:type="dxa" w:w="100"/>
+              <w:bottom w:type="dxa" w:w="60"/>
+              <w:right w:type="dxa" w:w="100"/>
+            </w:tcMar>
+          </w:tcPr>
+          <w:p>
+            <w:r>
+              <w:rPr>
+                <w:rFonts w:ascii="맑은 고딕" w:cs="맑은 고딕" w:eastAsia="맑은 고딕" w:hAnsi="맑은 고딕"/>
+                <w:b w:val="false"/>
+                <w:bCs w:val="false"/>
+                <w:sz w:val="19"/>
+                <w:szCs w:val="19"/>
+              </w:rPr>
               <w:t xml:space="preserve">판단 불일치 시 처리</w:t>
             </w:r>
           </w:p>
@@ -7190,6 +8460,1112 @@
                 <w:szCs w:val="19"/>
               </w:rPr>
               <w:t xml:space="preserve">검토자 간 최종 판단이 다른 경우의 처리 절차는 BaseKit 5(인간감독 운영계획) 참고</w:t>
+            </w:r>
+          </w:p>
+        </w:tc>
+      </w:tr>
+    </w:tbl>
+    <w:p>
+      <w:pPr>
+        <w:pStyle w:val="Heading2"/>
+        <w:spacing w:after="120" w:before="240"/>
+      </w:pPr>
+      <w:r>
+        <w:t xml:space="preserve">2-7. 역할 분담 (RACI)</w:t>
+      </w:r>
+    </w:p>
+    <w:p>
+      <w:pPr>
+        <w:spacing w:after="120"/>
+      </w:pPr>
+      <w:r>
+        <w:rPr>
+          <w:rFonts w:ascii="맑은 고딕" w:cs="맑은 고딕" w:eastAsia="맑은 고딕" w:hAnsi="맑은 고딕"/>
+          <w:i/>
+          <w:iCs/>
+          <w:color w:val="555555"/>
+          <w:sz w:val="18"/>
+          <w:szCs w:val="18"/>
+        </w:rPr>
+        <w:t xml:space="preserve">R=실행 / A=최종 책임 / C=협의 / I=공유. 3개 필수 역할 기준 초안이며 실제 팀원 배정은 팀 확인 후 확정한다.</w:t>
+      </w:r>
+    </w:p>
+    <w:tbl>
+      <w:tblPr>
+        <w:tblW w:type="dxa" w:w="9600"/>
+        <w:tblBorders>
+          <w:top w:val="single" w:color="auto" w:sz="4"/>
+          <w:left w:val="single" w:color="auto" w:sz="4"/>
+          <w:bottom w:val="single" w:color="auto" w:sz="4"/>
+          <w:right w:val="single" w:color="auto" w:sz="4"/>
+          <w:insideH w:val="single" w:color="auto" w:sz="4"/>
+          <w:insideV w:val="single" w:color="auto" w:sz="4"/>
+        </w:tblBorders>
+      </w:tblPr>
+      <w:tblGrid>
+        <w:gridCol w:w="3400"/>
+        <w:gridCol w:w="1500"/>
+        <w:gridCol w:w="1600"/>
+        <w:gridCol w:w="1600"/>
+        <w:gridCol w:w="1500"/>
+      </w:tblGrid>
+      <w:tr>
+        <w:trPr>
+          <w:tblHeader/>
+        </w:trPr>
+        <w:tc>
+          <w:tcPr>
+            <w:tcW w:type="dxa" w:w="3400"/>
+            <w:shd w:fill="D9D9F3" w:val="clear"/>
+            <w:tcMar>
+              <w:top w:type="dxa" w:w="60"/>
+              <w:left w:type="dxa" w:w="100"/>
+              <w:bottom w:type="dxa" w:w="60"/>
+              <w:right w:type="dxa" w:w="100"/>
+            </w:tcMar>
+          </w:tcPr>
+          <w:p>
+            <w:r>
+              <w:rPr>
+                <w:rFonts w:ascii="맑은 고딕" w:cs="맑은 고딕" w:eastAsia="맑은 고딕" w:hAnsi="맑은 고딕"/>
+                <w:b/>
+                <w:bCs/>
+                <w:sz w:val="20"/>
+                <w:szCs w:val="20"/>
+              </w:rPr>
+              <w:t xml:space="preserve">활동</w:t>
+            </w:r>
+          </w:p>
+        </w:tc>
+        <w:tc>
+          <w:tcPr>
+            <w:tcW w:type="dxa" w:w="1500"/>
+            <w:shd w:fill="D9D9F3" w:val="clear"/>
+            <w:tcMar>
+              <w:top w:type="dxa" w:w="60"/>
+              <w:left w:type="dxa" w:w="100"/>
+              <w:bottom w:type="dxa" w:w="60"/>
+              <w:right w:type="dxa" w:w="100"/>
+            </w:tcMar>
+          </w:tcPr>
+          <w:p>
+            <w:r>
+              <w:rPr>
+                <w:rFonts w:ascii="맑은 고딕" w:cs="맑은 고딕" w:eastAsia="맑은 고딕" w:hAnsi="맑은 고딕"/>
+                <w:b/>
+                <w:bCs/>
+                <w:sz w:val="20"/>
+                <w:szCs w:val="20"/>
+              </w:rPr>
+              <w:t xml:space="preserve">AI 기획자</w:t>
+            </w:r>
+          </w:p>
+        </w:tc>
+        <w:tc>
+          <w:tcPr>
+            <w:tcW w:type="dxa" w:w="1600"/>
+            <w:shd w:fill="D9D9F3" w:val="clear"/>
+            <w:tcMar>
+              <w:top w:type="dxa" w:w="60"/>
+              <w:left w:type="dxa" w:w="100"/>
+              <w:bottom w:type="dxa" w:w="60"/>
+              <w:right w:type="dxa" w:w="100"/>
+            </w:tcMar>
+          </w:tcPr>
+          <w:p>
+            <w:r>
+              <w:rPr>
+                <w:rFonts w:ascii="맑은 고딕" w:cs="맑은 고딕" w:eastAsia="맑은 고딕" w:hAnsi="맑은 고딕"/>
+                <w:b/>
+                <w:bCs/>
+                <w:sz w:val="20"/>
+                <w:szCs w:val="20"/>
+              </w:rPr>
+              <w:t xml:space="preserve">데이터 과학자</w:t>
+            </w:r>
+          </w:p>
+        </w:tc>
+        <w:tc>
+          <w:tcPr>
+            <w:tcW w:type="dxa" w:w="1600"/>
+            <w:shd w:fill="D9D9F3" w:val="clear"/>
+            <w:tcMar>
+              <w:top w:type="dxa" w:w="60"/>
+              <w:left w:type="dxa" w:w="100"/>
+              <w:bottom w:type="dxa" w:w="60"/>
+              <w:right w:type="dxa" w:w="100"/>
+            </w:tcMar>
+          </w:tcPr>
+          <w:p>
+            <w:r>
+              <w:rPr>
+                <w:rFonts w:ascii="맑은 고딕" w:cs="맑은 고딕" w:eastAsia="맑은 고딕" w:hAnsi="맑은 고딕"/>
+                <w:b/>
+                <w:bCs/>
+                <w:sz w:val="20"/>
+                <w:szCs w:val="20"/>
+              </w:rPr>
+              <w:t xml:space="preserve">AI 엔지니어</w:t>
+            </w:r>
+          </w:p>
+        </w:tc>
+        <w:tc>
+          <w:tcPr>
+            <w:tcW w:type="dxa" w:w="1500"/>
+            <w:shd w:fill="D9D9F3" w:val="clear"/>
+            <w:tcMar>
+              <w:top w:type="dxa" w:w="60"/>
+              <w:left w:type="dxa" w:w="100"/>
+              <w:bottom w:type="dxa" w:w="60"/>
+              <w:right w:type="dxa" w:w="100"/>
+            </w:tcMar>
+          </w:tcPr>
+          <w:p>
+            <w:r>
+              <w:rPr>
+                <w:rFonts w:ascii="맑은 고딕" w:cs="맑은 고딕" w:eastAsia="맑은 고딕" w:hAnsi="맑은 고딕"/>
+                <w:b/>
+                <w:bCs/>
+                <w:sz w:val="20"/>
+                <w:szCs w:val="20"/>
+              </w:rPr>
+              <w:t xml:space="preserve">검토자(운영팀)</w:t>
+            </w:r>
+          </w:p>
+        </w:tc>
+      </w:tr>
+      <w:tr>
+        <w:tc>
+          <w:tcPr>
+            <w:tcW w:type="dxa" w:w="3400"/>
+            <w:tcMar>
+              <w:top w:type="dxa" w:w="60"/>
+              <w:left w:type="dxa" w:w="100"/>
+              <w:bottom w:type="dxa" w:w="60"/>
+              <w:right w:type="dxa" w:w="100"/>
+            </w:tcMar>
+          </w:tcPr>
+          <w:p>
+            <w:r>
+              <w:rPr>
+                <w:rFonts w:ascii="맑은 고딕" w:cs="맑은 고딕" w:eastAsia="맑은 고딕" w:hAnsi="맑은 고딕"/>
+                <w:b w:val="false"/>
+                <w:bCs w:val="false"/>
+                <w:sz w:val="19"/>
+                <w:szCs w:val="19"/>
+              </w:rPr>
+              <w:t xml:space="preserve">서비스 정의·영향 분석·위험 등록부 관리</w:t>
+            </w:r>
+          </w:p>
+        </w:tc>
+        <w:tc>
+          <w:tcPr>
+            <w:tcW w:type="dxa" w:w="1500"/>
+            <w:tcMar>
+              <w:top w:type="dxa" w:w="60"/>
+              <w:left w:type="dxa" w:w="100"/>
+              <w:bottom w:type="dxa" w:w="60"/>
+              <w:right w:type="dxa" w:w="100"/>
+            </w:tcMar>
+          </w:tcPr>
+          <w:p>
+            <w:r>
+              <w:rPr>
+                <w:rFonts w:ascii="맑은 고딕" w:cs="맑은 고딕" w:eastAsia="맑은 고딕" w:hAnsi="맑은 고딕"/>
+                <w:b w:val="false"/>
+                <w:bCs w:val="false"/>
+                <w:sz w:val="19"/>
+                <w:szCs w:val="19"/>
+              </w:rPr>
+              <w:t xml:space="preserve">A/R</w:t>
+            </w:r>
+          </w:p>
+        </w:tc>
+        <w:tc>
+          <w:tcPr>
+            <w:tcW w:type="dxa" w:w="1600"/>
+            <w:tcMar>
+              <w:top w:type="dxa" w:w="60"/>
+              <w:left w:type="dxa" w:w="100"/>
+              <w:bottom w:type="dxa" w:w="60"/>
+              <w:right w:type="dxa" w:w="100"/>
+            </w:tcMar>
+          </w:tcPr>
+          <w:p>
+            <w:r>
+              <w:rPr>
+                <w:rFonts w:ascii="맑은 고딕" w:cs="맑은 고딕" w:eastAsia="맑은 고딕" w:hAnsi="맑은 고딕"/>
+                <w:b w:val="false"/>
+                <w:bCs w:val="false"/>
+                <w:sz w:val="19"/>
+                <w:szCs w:val="19"/>
+              </w:rPr>
+              <w:t xml:space="preserve">C</w:t>
+            </w:r>
+          </w:p>
+        </w:tc>
+        <w:tc>
+          <w:tcPr>
+            <w:tcW w:type="dxa" w:w="1600"/>
+            <w:tcMar>
+              <w:top w:type="dxa" w:w="60"/>
+              <w:left w:type="dxa" w:w="100"/>
+              <w:bottom w:type="dxa" w:w="60"/>
+              <w:right w:type="dxa" w:w="100"/>
+            </w:tcMar>
+          </w:tcPr>
+          <w:p>
+            <w:r>
+              <w:rPr>
+                <w:rFonts w:ascii="맑은 고딕" w:cs="맑은 고딕" w:eastAsia="맑은 고딕" w:hAnsi="맑은 고딕"/>
+                <w:b w:val="false"/>
+                <w:bCs w:val="false"/>
+                <w:sz w:val="19"/>
+                <w:szCs w:val="19"/>
+              </w:rPr>
+              <w:t xml:space="preserve">C</w:t>
+            </w:r>
+          </w:p>
+        </w:tc>
+        <w:tc>
+          <w:tcPr>
+            <w:tcW w:type="dxa" w:w="1500"/>
+            <w:tcMar>
+              <w:top w:type="dxa" w:w="60"/>
+              <w:left w:type="dxa" w:w="100"/>
+              <w:bottom w:type="dxa" w:w="60"/>
+              <w:right w:type="dxa" w:w="100"/>
+            </w:tcMar>
+          </w:tcPr>
+          <w:p>
+            <w:r>
+              <w:rPr>
+                <w:rFonts w:ascii="맑은 고딕" w:cs="맑은 고딕" w:eastAsia="맑은 고딕" w:hAnsi="맑은 고딕"/>
+                <w:b w:val="false"/>
+                <w:bCs w:val="false"/>
+                <w:sz w:val="19"/>
+                <w:szCs w:val="19"/>
+              </w:rPr>
+              <w:t xml:space="preserve">C</w:t>
+            </w:r>
+          </w:p>
+        </w:tc>
+      </w:tr>
+      <w:tr>
+        <w:tc>
+          <w:tcPr>
+            <w:tcW w:type="dxa" w:w="3400"/>
+            <w:tcMar>
+              <w:top w:type="dxa" w:w="60"/>
+              <w:left w:type="dxa" w:w="100"/>
+              <w:bottom w:type="dxa" w:w="60"/>
+              <w:right w:type="dxa" w:w="100"/>
+            </w:tcMar>
+          </w:tcPr>
+          <w:p>
+            <w:r>
+              <w:rPr>
+                <w:rFonts w:ascii="맑은 고딕" w:cs="맑은 고딕" w:eastAsia="맑은 고딕" w:hAnsi="맑은 고딕"/>
+                <w:b w:val="false"/>
+                <w:bCs w:val="false"/>
+                <w:sz w:val="19"/>
+                <w:szCs w:val="19"/>
+              </w:rPr>
+              <w:t xml:space="preserve">데이터 구성(메인/보조 활용·분할)</w:t>
+            </w:r>
+          </w:p>
+        </w:tc>
+        <w:tc>
+          <w:tcPr>
+            <w:tcW w:type="dxa" w:w="1500"/>
+            <w:tcMar>
+              <w:top w:type="dxa" w:w="60"/>
+              <w:left w:type="dxa" w:w="100"/>
+              <w:bottom w:type="dxa" w:w="60"/>
+              <w:right w:type="dxa" w:w="100"/>
+            </w:tcMar>
+          </w:tcPr>
+          <w:p>
+            <w:r>
+              <w:rPr>
+                <w:rFonts w:ascii="맑은 고딕" w:cs="맑은 고딕" w:eastAsia="맑은 고딕" w:hAnsi="맑은 고딕"/>
+                <w:b w:val="false"/>
+                <w:bCs w:val="false"/>
+                <w:sz w:val="19"/>
+                <w:szCs w:val="19"/>
+              </w:rPr>
+              <w:t xml:space="preserve">C</w:t>
+            </w:r>
+          </w:p>
+        </w:tc>
+        <w:tc>
+          <w:tcPr>
+            <w:tcW w:type="dxa" w:w="1600"/>
+            <w:tcMar>
+              <w:top w:type="dxa" w:w="60"/>
+              <w:left w:type="dxa" w:w="100"/>
+              <w:bottom w:type="dxa" w:w="60"/>
+              <w:right w:type="dxa" w:w="100"/>
+            </w:tcMar>
+          </w:tcPr>
+          <w:p>
+            <w:r>
+              <w:rPr>
+                <w:rFonts w:ascii="맑은 고딕" w:cs="맑은 고딕" w:eastAsia="맑은 고딕" w:hAnsi="맑은 고딕"/>
+                <w:b w:val="false"/>
+                <w:bCs w:val="false"/>
+                <w:sz w:val="19"/>
+                <w:szCs w:val="19"/>
+              </w:rPr>
+              <w:t xml:space="preserve">A/R</w:t>
+            </w:r>
+          </w:p>
+        </w:tc>
+        <w:tc>
+          <w:tcPr>
+            <w:tcW w:type="dxa" w:w="1600"/>
+            <w:tcMar>
+              <w:top w:type="dxa" w:w="60"/>
+              <w:left w:type="dxa" w:w="100"/>
+              <w:bottom w:type="dxa" w:w="60"/>
+              <w:right w:type="dxa" w:w="100"/>
+            </w:tcMar>
+          </w:tcPr>
+          <w:p>
+            <w:r>
+              <w:rPr>
+                <w:rFonts w:ascii="맑은 고딕" w:cs="맑은 고딕" w:eastAsia="맑은 고딕" w:hAnsi="맑은 고딕"/>
+                <w:b w:val="false"/>
+                <w:bCs w:val="false"/>
+                <w:sz w:val="19"/>
+                <w:szCs w:val="19"/>
+              </w:rPr>
+              <w:t xml:space="preserve">I</w:t>
+            </w:r>
+          </w:p>
+        </w:tc>
+        <w:tc>
+          <w:tcPr>
+            <w:tcW w:type="dxa" w:w="1500"/>
+            <w:tcMar>
+              <w:top w:type="dxa" w:w="60"/>
+              <w:left w:type="dxa" w:w="100"/>
+              <w:bottom w:type="dxa" w:w="60"/>
+              <w:right w:type="dxa" w:w="100"/>
+            </w:tcMar>
+          </w:tcPr>
+          <w:p>
+            <w:r>
+              <w:rPr>
+                <w:rFonts w:ascii="맑은 고딕" w:cs="맑은 고딕" w:eastAsia="맑은 고딕" w:hAnsi="맑은 고딕"/>
+                <w:b w:val="false"/>
+                <w:bCs w:val="false"/>
+                <w:sz w:val="19"/>
+                <w:szCs w:val="19"/>
+              </w:rPr>
+              <w:t xml:space="preserve">I</w:t>
+            </w:r>
+          </w:p>
+        </w:tc>
+      </w:tr>
+      <w:tr>
+        <w:tc>
+          <w:tcPr>
+            <w:tcW w:type="dxa" w:w="3400"/>
+            <w:tcMar>
+              <w:top w:type="dxa" w:w="60"/>
+              <w:left w:type="dxa" w:w="100"/>
+              <w:bottom w:type="dxa" w:w="60"/>
+              <w:right w:type="dxa" w:w="100"/>
+            </w:tcMar>
+          </w:tcPr>
+          <w:p>
+            <w:r>
+              <w:rPr>
+                <w:rFonts w:ascii="맑은 고딕" w:cs="맑은 고딕" w:eastAsia="맑은 고딕" w:hAnsi="맑은 고딕"/>
+                <w:b w:val="false"/>
+                <w:bCs w:val="false"/>
+                <w:sz w:val="19"/>
+                <w:szCs w:val="19"/>
+              </w:rPr>
+              <w:t xml:space="preserve">신뢰도 보정·임계값(애매 구간) 설정</w:t>
+            </w:r>
+          </w:p>
+        </w:tc>
+        <w:tc>
+          <w:tcPr>
+            <w:tcW w:type="dxa" w:w="1500"/>
+            <w:tcMar>
+              <w:top w:type="dxa" w:w="60"/>
+              <w:left w:type="dxa" w:w="100"/>
+              <w:bottom w:type="dxa" w:w="60"/>
+              <w:right w:type="dxa" w:w="100"/>
+            </w:tcMar>
+          </w:tcPr>
+          <w:p>
+            <w:r>
+              <w:rPr>
+                <w:rFonts w:ascii="맑은 고딕" w:cs="맑은 고딕" w:eastAsia="맑은 고딕" w:hAnsi="맑은 고딕"/>
+                <w:b w:val="false"/>
+                <w:bCs w:val="false"/>
+                <w:sz w:val="19"/>
+                <w:szCs w:val="19"/>
+              </w:rPr>
+              <w:t xml:space="preserve">A</w:t>
+            </w:r>
+          </w:p>
+        </w:tc>
+        <w:tc>
+          <w:tcPr>
+            <w:tcW w:type="dxa" w:w="1600"/>
+            <w:tcMar>
+              <w:top w:type="dxa" w:w="60"/>
+              <w:left w:type="dxa" w:w="100"/>
+              <w:bottom w:type="dxa" w:w="60"/>
+              <w:right w:type="dxa" w:w="100"/>
+            </w:tcMar>
+          </w:tcPr>
+          <w:p>
+            <w:r>
+              <w:rPr>
+                <w:rFonts w:ascii="맑은 고딕" w:cs="맑은 고딕" w:eastAsia="맑은 고딕" w:hAnsi="맑은 고딕"/>
+                <w:b w:val="false"/>
+                <w:bCs w:val="false"/>
+                <w:sz w:val="19"/>
+                <w:szCs w:val="19"/>
+              </w:rPr>
+              <w:t xml:space="preserve">R</w:t>
+            </w:r>
+          </w:p>
+        </w:tc>
+        <w:tc>
+          <w:tcPr>
+            <w:tcW w:type="dxa" w:w="1600"/>
+            <w:tcMar>
+              <w:top w:type="dxa" w:w="60"/>
+              <w:left w:type="dxa" w:w="100"/>
+              <w:bottom w:type="dxa" w:w="60"/>
+              <w:right w:type="dxa" w:w="100"/>
+            </w:tcMar>
+          </w:tcPr>
+          <w:p>
+            <w:r>
+              <w:rPr>
+                <w:rFonts w:ascii="맑은 고딕" w:cs="맑은 고딕" w:eastAsia="맑은 고딕" w:hAnsi="맑은 고딕"/>
+                <w:b w:val="false"/>
+                <w:bCs w:val="false"/>
+                <w:sz w:val="19"/>
+                <w:szCs w:val="19"/>
+              </w:rPr>
+              <w:t xml:space="preserve">C</w:t>
+            </w:r>
+          </w:p>
+        </w:tc>
+        <w:tc>
+          <w:tcPr>
+            <w:tcW w:type="dxa" w:w="1500"/>
+            <w:tcMar>
+              <w:top w:type="dxa" w:w="60"/>
+              <w:left w:type="dxa" w:w="100"/>
+              <w:bottom w:type="dxa" w:w="60"/>
+              <w:right w:type="dxa" w:w="100"/>
+            </w:tcMar>
+          </w:tcPr>
+          <w:p>
+            <w:r>
+              <w:rPr>
+                <w:rFonts w:ascii="맑은 고딕" w:cs="맑은 고딕" w:eastAsia="맑은 고딕" w:hAnsi="맑은 고딕"/>
+                <w:b w:val="false"/>
+                <w:bCs w:val="false"/>
+                <w:sz w:val="19"/>
+                <w:szCs w:val="19"/>
+              </w:rPr>
+              <w:t xml:space="preserve">I</w:t>
+            </w:r>
+          </w:p>
+        </w:tc>
+      </w:tr>
+      <w:tr>
+        <w:tc>
+          <w:tcPr>
+            <w:tcW w:type="dxa" w:w="3400"/>
+            <w:tcMar>
+              <w:top w:type="dxa" w:w="60"/>
+              <w:left w:type="dxa" w:w="100"/>
+              <w:bottom w:type="dxa" w:w="60"/>
+              <w:right w:type="dxa" w:w="100"/>
+            </w:tcMar>
+          </w:tcPr>
+          <w:p>
+            <w:r>
+              <w:rPr>
+                <w:rFonts w:ascii="맑은 고딕" w:cs="맑은 고딕" w:eastAsia="맑은 고딕" w:hAnsi="맑은 고딕"/>
+                <w:b w:val="false"/>
+                <w:bCs w:val="false"/>
+                <w:sz w:val="19"/>
+                <w:szCs w:val="19"/>
+              </w:rPr>
+              <w:t xml:space="preserve">모델 호출·출력 형식·인젝션 방어</w:t>
+            </w:r>
+          </w:p>
+        </w:tc>
+        <w:tc>
+          <w:tcPr>
+            <w:tcW w:type="dxa" w:w="1500"/>
+            <w:tcMar>
+              <w:top w:type="dxa" w:w="60"/>
+              <w:left w:type="dxa" w:w="100"/>
+              <w:bottom w:type="dxa" w:w="60"/>
+              <w:right w:type="dxa" w:w="100"/>
+            </w:tcMar>
+          </w:tcPr>
+          <w:p>
+            <w:r>
+              <w:rPr>
+                <w:rFonts w:ascii="맑은 고딕" w:cs="맑은 고딕" w:eastAsia="맑은 고딕" w:hAnsi="맑은 고딕"/>
+                <w:b w:val="false"/>
+                <w:bCs w:val="false"/>
+                <w:sz w:val="19"/>
+                <w:szCs w:val="19"/>
+              </w:rPr>
+              <w:t xml:space="preserve">C</w:t>
+            </w:r>
+          </w:p>
+        </w:tc>
+        <w:tc>
+          <w:tcPr>
+            <w:tcW w:type="dxa" w:w="1600"/>
+            <w:tcMar>
+              <w:top w:type="dxa" w:w="60"/>
+              <w:left w:type="dxa" w:w="100"/>
+              <w:bottom w:type="dxa" w:w="60"/>
+              <w:right w:type="dxa" w:w="100"/>
+            </w:tcMar>
+          </w:tcPr>
+          <w:p>
+            <w:r>
+              <w:rPr>
+                <w:rFonts w:ascii="맑은 고딕" w:cs="맑은 고딕" w:eastAsia="맑은 고딕" w:hAnsi="맑은 고딕"/>
+                <w:b w:val="false"/>
+                <w:bCs w:val="false"/>
+                <w:sz w:val="19"/>
+                <w:szCs w:val="19"/>
+              </w:rPr>
+              <w:t xml:space="preserve">C</w:t>
+            </w:r>
+          </w:p>
+        </w:tc>
+        <w:tc>
+          <w:tcPr>
+            <w:tcW w:type="dxa" w:w="1600"/>
+            <w:tcMar>
+              <w:top w:type="dxa" w:w="60"/>
+              <w:left w:type="dxa" w:w="100"/>
+              <w:bottom w:type="dxa" w:w="60"/>
+              <w:right w:type="dxa" w:w="100"/>
+            </w:tcMar>
+          </w:tcPr>
+          <w:p>
+            <w:r>
+              <w:rPr>
+                <w:rFonts w:ascii="맑은 고딕" w:cs="맑은 고딕" w:eastAsia="맑은 고딕" w:hAnsi="맑은 고딕"/>
+                <w:b w:val="false"/>
+                <w:bCs w:val="false"/>
+                <w:sz w:val="19"/>
+                <w:szCs w:val="19"/>
+              </w:rPr>
+              <w:t xml:space="preserve">A/R</w:t>
+            </w:r>
+          </w:p>
+        </w:tc>
+        <w:tc>
+          <w:tcPr>
+            <w:tcW w:type="dxa" w:w="1500"/>
+            <w:tcMar>
+              <w:top w:type="dxa" w:w="60"/>
+              <w:left w:type="dxa" w:w="100"/>
+              <w:bottom w:type="dxa" w:w="60"/>
+              <w:right w:type="dxa" w:w="100"/>
+            </w:tcMar>
+          </w:tcPr>
+          <w:p>
+            <w:r>
+              <w:rPr>
+                <w:rFonts w:ascii="맑은 고딕" w:cs="맑은 고딕" w:eastAsia="맑은 고딕" w:hAnsi="맑은 고딕"/>
+                <w:b w:val="false"/>
+                <w:bCs w:val="false"/>
+                <w:sz w:val="19"/>
+                <w:szCs w:val="19"/>
+              </w:rPr>
+              <w:t xml:space="preserve">I</w:t>
+            </w:r>
+          </w:p>
+        </w:tc>
+      </w:tr>
+      <w:tr>
+        <w:tc>
+          <w:tcPr>
+            <w:tcW w:type="dxa" w:w="3400"/>
+            <w:tcMar>
+              <w:top w:type="dxa" w:w="60"/>
+              <w:left w:type="dxa" w:w="100"/>
+              <w:bottom w:type="dxa" w:w="60"/>
+              <w:right w:type="dxa" w:w="100"/>
+            </w:tcMar>
+          </w:tcPr>
+          <w:p>
+            <w:r>
+              <w:rPr>
+                <w:rFonts w:ascii="맑은 고딕" w:cs="맑은 고딕" w:eastAsia="맑은 고딕" w:hAnsi="맑은 고딕"/>
+                <w:b w:val="false"/>
+                <w:bCs w:val="false"/>
+                <w:sz w:val="19"/>
+                <w:szCs w:val="19"/>
+              </w:rPr>
+              <w:t xml:space="preserve">인간감독 절차·SLA 설계</w:t>
+            </w:r>
+          </w:p>
+        </w:tc>
+        <w:tc>
+          <w:tcPr>
+            <w:tcW w:type="dxa" w:w="1500"/>
+            <w:tcMar>
+              <w:top w:type="dxa" w:w="60"/>
+              <w:left w:type="dxa" w:w="100"/>
+              <w:bottom w:type="dxa" w:w="60"/>
+              <w:right w:type="dxa" w:w="100"/>
+            </w:tcMar>
+          </w:tcPr>
+          <w:p>
+            <w:r>
+              <w:rPr>
+                <w:rFonts w:ascii="맑은 고딕" w:cs="맑은 고딕" w:eastAsia="맑은 고딕" w:hAnsi="맑은 고딕"/>
+                <w:b w:val="false"/>
+                <w:bCs w:val="false"/>
+                <w:sz w:val="19"/>
+                <w:szCs w:val="19"/>
+              </w:rPr>
+              <w:t xml:space="preserve">A/R</w:t>
+            </w:r>
+          </w:p>
+        </w:tc>
+        <w:tc>
+          <w:tcPr>
+            <w:tcW w:type="dxa" w:w="1600"/>
+            <w:tcMar>
+              <w:top w:type="dxa" w:w="60"/>
+              <w:left w:type="dxa" w:w="100"/>
+              <w:bottom w:type="dxa" w:w="60"/>
+              <w:right w:type="dxa" w:w="100"/>
+            </w:tcMar>
+          </w:tcPr>
+          <w:p>
+            <w:r>
+              <w:rPr>
+                <w:rFonts w:ascii="맑은 고딕" w:cs="맑은 고딕" w:eastAsia="맑은 고딕" w:hAnsi="맑은 고딕"/>
+                <w:b w:val="false"/>
+                <w:bCs w:val="false"/>
+                <w:sz w:val="19"/>
+                <w:szCs w:val="19"/>
+              </w:rPr>
+              <w:t xml:space="preserve">I</w:t>
+            </w:r>
+          </w:p>
+        </w:tc>
+        <w:tc>
+          <w:tcPr>
+            <w:tcW w:type="dxa" w:w="1600"/>
+            <w:tcMar>
+              <w:top w:type="dxa" w:w="60"/>
+              <w:left w:type="dxa" w:w="100"/>
+              <w:bottom w:type="dxa" w:w="60"/>
+              <w:right w:type="dxa" w:w="100"/>
+            </w:tcMar>
+          </w:tcPr>
+          <w:p>
+            <w:r>
+              <w:rPr>
+                <w:rFonts w:ascii="맑은 고딕" w:cs="맑은 고딕" w:eastAsia="맑은 고딕" w:hAnsi="맑은 고딕"/>
+                <w:b w:val="false"/>
+                <w:bCs w:val="false"/>
+                <w:sz w:val="19"/>
+                <w:szCs w:val="19"/>
+              </w:rPr>
+              <w:t xml:space="preserve">C</w:t>
+            </w:r>
+          </w:p>
+        </w:tc>
+        <w:tc>
+          <w:tcPr>
+            <w:tcW w:type="dxa" w:w="1500"/>
+            <w:tcMar>
+              <w:top w:type="dxa" w:w="60"/>
+              <w:left w:type="dxa" w:w="100"/>
+              <w:bottom w:type="dxa" w:w="60"/>
+              <w:right w:type="dxa" w:w="100"/>
+            </w:tcMar>
+          </w:tcPr>
+          <w:p>
+            <w:r>
+              <w:rPr>
+                <w:rFonts w:ascii="맑은 고딕" w:cs="맑은 고딕" w:eastAsia="맑은 고딕" w:hAnsi="맑은 고딕"/>
+                <w:b w:val="false"/>
+                <w:bCs w:val="false"/>
+                <w:sz w:val="19"/>
+                <w:szCs w:val="19"/>
+              </w:rPr>
+              <w:t xml:space="preserve">C</w:t>
+            </w:r>
+          </w:p>
+        </w:tc>
+      </w:tr>
+      <w:tr>
+        <w:tc>
+          <w:tcPr>
+            <w:tcW w:type="dxa" w:w="3400"/>
+            <w:tcMar>
+              <w:top w:type="dxa" w:w="60"/>
+              <w:left w:type="dxa" w:w="100"/>
+              <w:bottom w:type="dxa" w:w="60"/>
+              <w:right w:type="dxa" w:w="100"/>
+            </w:tcMar>
+          </w:tcPr>
+          <w:p>
+            <w:r>
+              <w:rPr>
+                <w:rFonts w:ascii="맑은 고딕" w:cs="맑은 고딕" w:eastAsia="맑은 고딕" w:hAnsi="맑은 고딕"/>
+                <w:b w:val="false"/>
+                <w:bCs w:val="false"/>
+                <w:sz w:val="19"/>
+                <w:szCs w:val="19"/>
+              </w:rPr>
+              <w:t xml:space="preserve">민감 카테고리 목록 관리</w:t>
+            </w:r>
+          </w:p>
+        </w:tc>
+        <w:tc>
+          <w:tcPr>
+            <w:tcW w:type="dxa" w:w="1500"/>
+            <w:tcMar>
+              <w:top w:type="dxa" w:w="60"/>
+              <w:left w:type="dxa" w:w="100"/>
+              <w:bottom w:type="dxa" w:w="60"/>
+              <w:right w:type="dxa" w:w="100"/>
+            </w:tcMar>
+          </w:tcPr>
+          <w:p>
+            <w:r>
+              <w:rPr>
+                <w:rFonts w:ascii="맑은 고딕" w:cs="맑은 고딕" w:eastAsia="맑은 고딕" w:hAnsi="맑은 고딕"/>
+                <w:b w:val="false"/>
+                <w:bCs w:val="false"/>
+                <w:sz w:val="19"/>
+                <w:szCs w:val="19"/>
+              </w:rPr>
+              <w:t xml:space="preserve">A/R</w:t>
+            </w:r>
+          </w:p>
+        </w:tc>
+        <w:tc>
+          <w:tcPr>
+            <w:tcW w:type="dxa" w:w="1600"/>
+            <w:tcMar>
+              <w:top w:type="dxa" w:w="60"/>
+              <w:left w:type="dxa" w:w="100"/>
+              <w:bottom w:type="dxa" w:w="60"/>
+              <w:right w:type="dxa" w:w="100"/>
+            </w:tcMar>
+          </w:tcPr>
+          <w:p>
+            <w:r>
+              <w:rPr>
+                <w:rFonts w:ascii="맑은 고딕" w:cs="맑은 고딕" w:eastAsia="맑은 고딕" w:hAnsi="맑은 고딕"/>
+                <w:b w:val="false"/>
+                <w:bCs w:val="false"/>
+                <w:sz w:val="19"/>
+                <w:szCs w:val="19"/>
+              </w:rPr>
+              <w:t xml:space="preserve">C</w:t>
+            </w:r>
+          </w:p>
+        </w:tc>
+        <w:tc>
+          <w:tcPr>
+            <w:tcW w:type="dxa" w:w="1600"/>
+            <w:tcMar>
+              <w:top w:type="dxa" w:w="60"/>
+              <w:left w:type="dxa" w:w="100"/>
+              <w:bottom w:type="dxa" w:w="60"/>
+              <w:right w:type="dxa" w:w="100"/>
+            </w:tcMar>
+          </w:tcPr>
+          <w:p>
+            <w:r>
+              <w:rPr>
+                <w:rFonts w:ascii="맑은 고딕" w:cs="맑은 고딕" w:eastAsia="맑은 고딕" w:hAnsi="맑은 고딕"/>
+                <w:b w:val="false"/>
+                <w:bCs w:val="false"/>
+                <w:sz w:val="19"/>
+                <w:szCs w:val="19"/>
+              </w:rPr>
+              <w:t xml:space="preserve">C</w:t>
+            </w:r>
+          </w:p>
+        </w:tc>
+        <w:tc>
+          <w:tcPr>
+            <w:tcW w:type="dxa" w:w="1500"/>
+            <w:tcMar>
+              <w:top w:type="dxa" w:w="60"/>
+              <w:left w:type="dxa" w:w="100"/>
+              <w:bottom w:type="dxa" w:w="60"/>
+              <w:right w:type="dxa" w:w="100"/>
+            </w:tcMar>
+          </w:tcPr>
+          <w:p>
+            <w:r>
+              <w:rPr>
+                <w:rFonts w:ascii="맑은 고딕" w:cs="맑은 고딕" w:eastAsia="맑은 고딕" w:hAnsi="맑은 고딕"/>
+                <w:b w:val="false"/>
+                <w:bCs w:val="false"/>
+                <w:sz w:val="19"/>
+                <w:szCs w:val="19"/>
+              </w:rPr>
+              <w:t xml:space="preserve">R</w:t>
+            </w:r>
+          </w:p>
+        </w:tc>
+      </w:tr>
+      <w:tr>
+        <w:tc>
+          <w:tcPr>
+            <w:tcW w:type="dxa" w:w="3400"/>
+            <w:tcMar>
+              <w:top w:type="dxa" w:w="60"/>
+              <w:left w:type="dxa" w:w="100"/>
+              <w:bottom w:type="dxa" w:w="60"/>
+              <w:right w:type="dxa" w:w="100"/>
+            </w:tcMar>
+          </w:tcPr>
+          <w:p>
+            <w:r>
+              <w:rPr>
+                <w:rFonts w:ascii="맑은 고딕" w:cs="맑은 고딕" w:eastAsia="맑은 고딕" w:hAnsi="맑은 고딕"/>
+                <w:b w:val="false"/>
+                <w:bCs w:val="false"/>
+                <w:sz w:val="19"/>
+                <w:szCs w:val="19"/>
+              </w:rPr>
+              <w:t xml:space="preserve">검토 수행·판단 기록</w:t>
+            </w:r>
+          </w:p>
+        </w:tc>
+        <w:tc>
+          <w:tcPr>
+            <w:tcW w:type="dxa" w:w="1500"/>
+            <w:tcMar>
+              <w:top w:type="dxa" w:w="60"/>
+              <w:left w:type="dxa" w:w="100"/>
+              <w:bottom w:type="dxa" w:w="60"/>
+              <w:right w:type="dxa" w:w="100"/>
+            </w:tcMar>
+          </w:tcPr>
+          <w:p>
+            <w:r>
+              <w:rPr>
+                <w:rFonts w:ascii="맑은 고딕" w:cs="맑은 고딕" w:eastAsia="맑은 고딕" w:hAnsi="맑은 고딕"/>
+                <w:b w:val="false"/>
+                <w:bCs w:val="false"/>
+                <w:sz w:val="19"/>
+                <w:szCs w:val="19"/>
+              </w:rPr>
+              <w:t xml:space="preserve">I</w:t>
+            </w:r>
+          </w:p>
+        </w:tc>
+        <w:tc>
+          <w:tcPr>
+            <w:tcW w:type="dxa" w:w="1600"/>
+            <w:tcMar>
+              <w:top w:type="dxa" w:w="60"/>
+              <w:left w:type="dxa" w:w="100"/>
+              <w:bottom w:type="dxa" w:w="60"/>
+              <w:right w:type="dxa" w:w="100"/>
+            </w:tcMar>
+          </w:tcPr>
+          <w:p>
+            <w:r>
+              <w:rPr>
+                <w:rFonts w:ascii="맑은 고딕" w:cs="맑은 고딕" w:eastAsia="맑은 고딕" w:hAnsi="맑은 고딕"/>
+                <w:b w:val="false"/>
+                <w:bCs w:val="false"/>
+                <w:sz w:val="19"/>
+                <w:szCs w:val="19"/>
+              </w:rPr>
+              <w:t xml:space="preserve">I</w:t>
+            </w:r>
+          </w:p>
+        </w:tc>
+        <w:tc>
+          <w:tcPr>
+            <w:tcW w:type="dxa" w:w="1600"/>
+            <w:tcMar>
+              <w:top w:type="dxa" w:w="60"/>
+              <w:left w:type="dxa" w:w="100"/>
+              <w:bottom w:type="dxa" w:w="60"/>
+              <w:right w:type="dxa" w:w="100"/>
+            </w:tcMar>
+          </w:tcPr>
+          <w:p>
+            <w:r>
+              <w:rPr>
+                <w:rFonts w:ascii="맑은 고딕" w:cs="맑은 고딕" w:eastAsia="맑은 고딕" w:hAnsi="맑은 고딕"/>
+                <w:b w:val="false"/>
+                <w:bCs w:val="false"/>
+                <w:sz w:val="19"/>
+                <w:szCs w:val="19"/>
+              </w:rPr>
+              <w:t xml:space="preserve">C</w:t>
+            </w:r>
+          </w:p>
+        </w:tc>
+        <w:tc>
+          <w:tcPr>
+            <w:tcW w:type="dxa" w:w="1500"/>
+            <w:tcMar>
+              <w:top w:type="dxa" w:w="60"/>
+              <w:left w:type="dxa" w:w="100"/>
+              <w:bottom w:type="dxa" w:w="60"/>
+              <w:right w:type="dxa" w:w="100"/>
+            </w:tcMar>
+          </w:tcPr>
+          <w:p>
+            <w:r>
+              <w:rPr>
+                <w:rFonts w:ascii="맑은 고딕" w:cs="맑은 고딕" w:eastAsia="맑은 고딕" w:hAnsi="맑은 고딕"/>
+                <w:b w:val="false"/>
+                <w:bCs w:val="false"/>
+                <w:sz w:val="19"/>
+                <w:szCs w:val="19"/>
+              </w:rPr>
+              <w:t xml:space="preserve">A/R</w:t>
+            </w:r>
+          </w:p>
+        </w:tc>
+      </w:tr>
+      <w:tr>
+        <w:tc>
+          <w:tcPr>
+            <w:tcW w:type="dxa" w:w="3400"/>
+            <w:tcMar>
+              <w:top w:type="dxa" w:w="60"/>
+              <w:left w:type="dxa" w:w="100"/>
+              <w:bottom w:type="dxa" w:w="60"/>
+              <w:right w:type="dxa" w:w="100"/>
+            </w:tcMar>
+          </w:tcPr>
+          <w:p>
+            <w:r>
+              <w:rPr>
+                <w:rFonts w:ascii="맑은 고딕" w:cs="맑은 고딕" w:eastAsia="맑은 고딕" w:hAnsi="맑은 고딕"/>
+                <w:b w:val="false"/>
+                <w:bCs w:val="false"/>
+                <w:sz w:val="19"/>
+                <w:szCs w:val="19"/>
+              </w:rPr>
+              <w:t xml:space="preserve">잔여 위험 재검토·임계값 재조정</w:t>
+            </w:r>
+          </w:p>
+        </w:tc>
+        <w:tc>
+          <w:tcPr>
+            <w:tcW w:type="dxa" w:w="1500"/>
+            <w:tcMar>
+              <w:top w:type="dxa" w:w="60"/>
+              <w:left w:type="dxa" w:w="100"/>
+              <w:bottom w:type="dxa" w:w="60"/>
+              <w:right w:type="dxa" w:w="100"/>
+            </w:tcMar>
+          </w:tcPr>
+          <w:p>
+            <w:r>
+              <w:rPr>
+                <w:rFonts w:ascii="맑은 고딕" w:cs="맑은 고딕" w:eastAsia="맑은 고딕" w:hAnsi="맑은 고딕"/>
+                <w:b w:val="false"/>
+                <w:bCs w:val="false"/>
+                <w:sz w:val="19"/>
+                <w:szCs w:val="19"/>
+              </w:rPr>
+              <w:t xml:space="preserve">A/R</w:t>
+            </w:r>
+          </w:p>
+        </w:tc>
+        <w:tc>
+          <w:tcPr>
+            <w:tcW w:type="dxa" w:w="1600"/>
+            <w:tcMar>
+              <w:top w:type="dxa" w:w="60"/>
+              <w:left w:type="dxa" w:w="100"/>
+              <w:bottom w:type="dxa" w:w="60"/>
+              <w:right w:type="dxa" w:w="100"/>
+            </w:tcMar>
+          </w:tcPr>
+          <w:p>
+            <w:r>
+              <w:rPr>
+                <w:rFonts w:ascii="맑은 고딕" w:cs="맑은 고딕" w:eastAsia="맑은 고딕" w:hAnsi="맑은 고딕"/>
+                <w:b w:val="false"/>
+                <w:bCs w:val="false"/>
+                <w:sz w:val="19"/>
+                <w:szCs w:val="19"/>
+              </w:rPr>
+              <w:t xml:space="preserve">R</w:t>
+            </w:r>
+          </w:p>
+        </w:tc>
+        <w:tc>
+          <w:tcPr>
+            <w:tcW w:type="dxa" w:w="1600"/>
+            <w:tcMar>
+              <w:top w:type="dxa" w:w="60"/>
+              <w:left w:type="dxa" w:w="100"/>
+              <w:bottom w:type="dxa" w:w="60"/>
+              <w:right w:type="dxa" w:w="100"/>
+            </w:tcMar>
+          </w:tcPr>
+          <w:p>
+            <w:r>
+              <w:rPr>
+                <w:rFonts w:ascii="맑은 고딕" w:cs="맑은 고딕" w:eastAsia="맑은 고딕" w:hAnsi="맑은 고딕"/>
+                <w:b w:val="false"/>
+                <w:bCs w:val="false"/>
+                <w:sz w:val="19"/>
+                <w:szCs w:val="19"/>
+              </w:rPr>
+              <w:t xml:space="preserve">C</w:t>
+            </w:r>
+          </w:p>
+        </w:tc>
+        <w:tc>
+          <w:tcPr>
+            <w:tcW w:type="dxa" w:w="1500"/>
+            <w:tcMar>
+              <w:top w:type="dxa" w:w="60"/>
+              <w:left w:type="dxa" w:w="100"/>
+              <w:bottom w:type="dxa" w:w="60"/>
+              <w:right w:type="dxa" w:w="100"/>
+            </w:tcMar>
+          </w:tcPr>
+          <w:p>
+            <w:r>
+              <w:rPr>
+                <w:rFonts w:ascii="맑은 고딕" w:cs="맑은 고딕" w:eastAsia="맑은 고딕" w:hAnsi="맑은 고딕"/>
+                <w:b w:val="false"/>
+                <w:bCs w:val="false"/>
+                <w:sz w:val="19"/>
+                <w:szCs w:val="19"/>
+              </w:rPr>
+              <w:t xml:space="preserve">C</w:t>
             </w:r>
           </w:p>
         </w:tc>

</xml_diff>